<commit_message>
#33 [Lab02S03] Aplicar identidade visual ao relatório final
</commit_message>
<xml_diff>
--- a/reports/final/lab02_relatorio_final.docx
+++ b/reports/final/lab02_relatorio_final.docx
@@ -2,6 +2,73 @@
 <file path=word/document.xml><?xml version="1.0" encoding="utf-8"?>
 <w:document xmlns:wpc="http://schemas.microsoft.com/office/word/2010/wordprocessingCanvas" xmlns:mo="http://schemas.microsoft.com/office/mac/office/2008/main" xmlns:mc="http://schemas.openxmlformats.org/markup-compatibility/2006" xmlns:mv="urn:schemas-microsoft-com:mac:vml" xmlns:o="urn:schemas-microsoft-com:office:office" xmlns:r="http://schemas.openxmlformats.org/officeDocument/2006/relationships" xmlns:m="http://schemas.openxmlformats.org/officeDocument/2006/math" xmlns:v="urn:schemas-microsoft-com:vml" xmlns:wp14="http://schemas.microsoft.com/office/word/2010/wordprocessingDrawing" xmlns:wp="http://schemas.openxmlformats.org/drawingml/2006/wordprocessingDrawing" xmlns:w10="urn:schemas-microsoft-com:office:word" xmlns:w="http://schemas.openxmlformats.org/wordprocessingml/2006/main" xmlns:w14="http://schemas.microsoft.com/office/word/2010/wordml" xmlns:wpg="http://schemas.microsoft.com/office/word/2010/wordprocessingGroup" xmlns:wpi="http://schemas.microsoft.com/office/word/2010/wordprocessingInk" xmlns:wne="http://schemas.microsoft.com/office/word/2006/wordml" xmlns:wps="http://schemas.microsoft.com/office/word/2010/wordprocessingShape" mc:Ignorable="w14 wp14">
   <w:body>
+    <w:p>
+      <w:pPr>
+        <w:spacing w:after="240"/>
+      </w:pPr>
+    </w:p>
+    <w:tbl>
+      <w:tblPr>
+        <w:tblW w:type="auto" w:w="0"/>
+        <w:jc w:val="center"/>
+        <w:tblLayout w:type="fixed"/>
+        <w:tblLook w:firstColumn="1" w:firstRow="1" w:lastColumn="0" w:lastRow="0" w:noHBand="0" w:noVBand="1" w:val="04A0"/>
+        <w:tblBorders>
+          <w:top w:val="nil"/>
+          <w:left w:val="nil"/>
+          <w:bottom w:val="nil"/>
+          <w:right w:val="nil"/>
+          <w:insideH w:val="nil"/>
+          <w:insideV w:val="nil"/>
+        </w:tblBorders>
+      </w:tblPr>
+      <w:tblGrid>
+        <w:gridCol w:w="9354"/>
+      </w:tblGrid>
+      <w:tr>
+        <w:tc>
+          <w:tcPr>
+            <w:tcW w:type="dxa" w:w="9354"/>
+            <w:vAlign w:val="center"/>
+            <w:tcMar>
+              <w:top w:w="420" w:type="dxa"/>
+              <w:start w:w="220" w:type="dxa"/>
+              <w:bottom w:w="420" w:type="dxa"/>
+              <w:end w:w="220" w:type="dxa"/>
+            </w:tcMar>
+            <w:shd w:fill="3333B2"/>
+          </w:tcPr>
+          <w:p>
+            <w:pPr>
+              <w:spacing w:after="160"/>
+              <w:jc w:val="center"/>
+            </w:pPr>
+            <w:r>
+              <w:rPr>
+                <w:rFonts w:ascii="Arial" w:hAnsi="Arial"/>
+                <w:b/>
+                <w:color w:val="FFFFFF"/>
+                <w:sz w:val="46"/>
+              </w:rPr>
+              <w:t>LABORATÓRIO 02</w:t>
+            </w:r>
+          </w:p>
+          <w:p>
+            <w:pPr>
+              <w:jc w:val="center"/>
+            </w:pPr>
+            <w:r>
+              <w:rPr>
+                <w:rFonts w:ascii="Arial" w:hAnsi="Arial"/>
+                <w:color w:val="FFFFFF"/>
+                <w:sz w:val="34"/>
+              </w:rPr>
+              <w:t>Assistentes de IA vs. Codificação Manual</w:t>
+            </w:r>
+          </w:p>
+        </w:tc>
+      </w:tr>
+    </w:tbl>
     <w:p>
       <w:pPr>
         <w:spacing w:after="560"/>
@@ -9,82 +76,62 @@
     </w:p>
     <w:p>
       <w:pPr>
-        <w:spacing w:after="80"/>
+        <w:spacing w:after="100"/>
+        <w:jc w:val="center"/>
+      </w:pPr>
+      <w:r>
+        <w:rPr>
+          <w:b/>
+          <w:color w:val="3333B2"/>
+        </w:rPr>
+        <w:t>Participantes:</w:t>
+      </w:r>
+    </w:p>
+    <w:p>
+      <w:pPr>
+        <w:spacing w:after="40"/>
+        <w:jc w:val="center"/>
+      </w:pPr>
+      <w:r>
+        <w:t>Fernanda Soares</w:t>
+      </w:r>
+    </w:p>
+    <w:p>
+      <w:pPr>
+        <w:spacing w:after="40"/>
+        <w:jc w:val="center"/>
+      </w:pPr>
+      <w:r>
+        <w:t>Islayder Jackson</w:t>
+      </w:r>
+    </w:p>
+    <w:p>
+      <w:pPr>
+        <w:spacing w:after="40"/>
+        <w:jc w:val="center"/>
+      </w:pPr>
+      <w:r>
+        <w:t>Vinicius Gomes</w:t>
+      </w:r>
+    </w:p>
+    <w:p>
+      <w:pPr>
+        <w:spacing w:after="400"/>
+      </w:pPr>
+    </w:p>
+    <w:p>
+      <w:pPr>
+        <w:spacing w:after="60"/>
         <w:jc w:val="center"/>
       </w:pPr>
       <w:r>
         <w:rPr>
           <w:rFonts w:ascii="Arial" w:hAnsi="Arial"/>
           <w:b/>
-          <w:color w:val="17365D"/>
-          <w:sz w:val="28"/>
+          <w:color w:val="3333B2"/>
+          <w:sz w:val="22"/>
         </w:rPr>
         <w:t>Pontifícia Universidade Católica de Minas Gerais</w:t>
-      </w:r>
-    </w:p>
-    <w:p>
-      <w:pPr>
-        <w:spacing w:after="80"/>
-        <w:jc w:val="center"/>
-      </w:pPr>
-      <w:r>
-        <w:rPr>
-          <w:rFonts w:ascii="Arial" w:hAnsi="Arial"/>
-          <w:b/>
-          <w:color w:val="202124"/>
-          <w:sz w:val="24"/>
-        </w:rPr>
-        <w:t>Engenharia de Software</w:t>
-      </w:r>
-    </w:p>
-    <w:p>
-      <w:pPr>
-        <w:spacing w:after="80"/>
-        <w:jc w:val="center"/>
-      </w:pPr>
-      <w:r>
-        <w:rPr>
-          <w:rFonts w:ascii="Arial" w:hAnsi="Arial"/>
-          <w:b w:val="0"/>
-          <w:color w:val="5B6573"/>
-          <w:sz w:val="24"/>
-        </w:rPr>
-        <w:t>Medição e Experimentação de Software</w:t>
-      </w:r>
-    </w:p>
-    <w:p>
-      <w:pPr>
-        <w:spacing w:after="760"/>
-      </w:pPr>
-    </w:p>
-    <w:p>
-      <w:pPr>
-        <w:spacing w:after="200"/>
-        <w:jc w:val="center"/>
-      </w:pPr>
-      <w:r>
-        <w:rPr>
-          <w:rFonts w:ascii="Arial" w:hAnsi="Arial"/>
-          <w:b/>
-          <w:color w:val="17365D"/>
-          <w:sz w:val="48"/>
-        </w:rPr>
-        <w:t>Laboratório 02</w:t>
-      </w:r>
-    </w:p>
-    <w:p>
-      <w:pPr>
-        <w:spacing w:after="1400"/>
-        <w:jc w:val="center"/>
-      </w:pPr>
-      <w:r>
-        <w:rPr>
-          <w:rFonts w:ascii="Arial" w:hAnsi="Arial"/>
-          <w:b/>
-          <w:color w:val="2F75B5"/>
-          <w:sz w:val="34"/>
-        </w:rPr>
-        <w:t>Assistentes de IA vs. Codificação Manual</w:t>
       </w:r>
     </w:p>
     <w:p>
@@ -94,46 +141,38 @@
       </w:pPr>
       <w:r>
         <w:rPr>
+          <w:rFonts w:ascii="Arial" w:hAnsi="Arial"/>
           <w:b/>
+          <w:color w:val="202124"/>
+          <w:sz w:val="21"/>
         </w:rPr>
-        <w:t>Participantes:</w:t>
+        <w:t>Engenharia de Software</w:t>
       </w:r>
     </w:p>
     <w:p>
       <w:pPr>
-        <w:spacing w:after="20"/>
+        <w:spacing w:after="60"/>
         <w:jc w:val="center"/>
       </w:pPr>
       <w:r>
-        <w:t>Fernanda Soares</w:t>
+        <w:rPr>
+          <w:rFonts w:ascii="Arial" w:hAnsi="Arial"/>
+          <w:b w:val="0"/>
+          <w:color w:val="5B6573"/>
+          <w:sz w:val="21"/>
+        </w:rPr>
+        <w:t>Medição e Experimentação de Software</w:t>
       </w:r>
     </w:p>
     <w:p>
       <w:pPr>
-        <w:spacing w:after="20"/>
-        <w:jc w:val="center"/>
-      </w:pPr>
-      <w:r>
-        <w:t>Islayder Jackson</w:t>
-      </w:r>
-    </w:p>
-    <w:p>
-      <w:pPr>
-        <w:spacing w:after="20"/>
-        <w:jc w:val="center"/>
-      </w:pPr>
-      <w:r>
-        <w:t>Vinicius Gomes</w:t>
-      </w:r>
-    </w:p>
-    <w:p>
-      <w:pPr>
-        <w:spacing w:before="160" w:after="80"/>
+        <w:spacing w:before="320" w:after="80"/>
         <w:jc w:val="center"/>
       </w:pPr>
       <w:r>
         <w:rPr>
           <w:b/>
+          <w:color w:val="3333B2"/>
         </w:rPr>
         <w:t xml:space="preserve">Professor: </w:t>
       </w:r>
@@ -143,7 +182,7 @@
     </w:p>
     <w:p>
       <w:pPr>
-        <w:spacing w:before="1100"/>
+        <w:spacing w:before="760"/>
         <w:jc w:val="center"/>
       </w:pPr>
       <w:r>
@@ -152,7 +191,7 @@
           <w:b/>
           <w:sz w:val="22"/>
         </w:rPr>
-        <w:t>2026</w:t>
+        <w:t>Setembro de 2026</w:t>
       </w:r>
     </w:p>
     <w:p>
@@ -163,8 +202,14 @@
     <w:p>
       <w:pPr>
         <w:pStyle w:val="Heading1"/>
+        <w:shd w:fill="3333B2"/>
+        <w:spacing w:before="260" w:after="160" w:line="259" w:lineRule="auto"/>
+        <w:ind w:left="102" w:right="0"/>
       </w:pPr>
       <w:r>
+        <w:rPr>
+          <w:color w:val="FFFFFF"/>
+        </w:rPr>
         <w:t>2. Sumário</w:t>
       </w:r>
     </w:p>
@@ -339,8 +384,14 @@
     <w:p>
       <w:pPr>
         <w:pStyle w:val="Heading1"/>
+        <w:shd w:fill="3333B2"/>
+        <w:spacing w:before="260" w:after="160" w:line="259" w:lineRule="auto"/>
+        <w:ind w:left="102" w:right="0"/>
       </w:pPr>
       <w:r>
+        <w:rPr>
+          <w:color w:val="FFFFFF"/>
+        </w:rPr>
         <w:t>3. Introdução</w:t>
       </w:r>
     </w:p>
@@ -356,7 +407,7 @@
       <w:r>
         <w:rPr>
           <w:rFonts w:ascii="Consolas" w:hAnsi="Consolas"/>
-          <w:color w:val="17365D"/>
+          <w:color w:val="3333B2"/>
           <w:sz w:val="18"/>
         </w:rPr>
         <w:t>SIM-*</w:t>
@@ -368,8 +419,14 @@
     <w:p>
       <w:pPr>
         <w:pStyle w:val="Heading1"/>
+        <w:shd w:fill="3333B2"/>
+        <w:spacing w:before="260" w:after="160" w:line="259" w:lineRule="auto"/>
+        <w:ind w:left="102" w:right="0"/>
       </w:pPr>
       <w:r>
+        <w:rPr>
+          <w:color w:val="FFFFFF"/>
+        </w:rPr>
         <w:t>4. Objetivos</w:t>
       </w:r>
     </w:p>
@@ -444,8 +501,14 @@
     <w:p>
       <w:pPr>
         <w:pStyle w:val="Heading1"/>
+        <w:shd w:fill="3333B2"/>
+        <w:spacing w:before="260" w:after="160" w:line="259" w:lineRule="auto"/>
+        <w:ind w:left="102" w:right="0"/>
       </w:pPr>
       <w:r>
+        <w:rPr>
+          <w:color w:val="FFFFFF"/>
+        </w:rPr>
         <w:t>5. Questões de pesquisa</w:t>
       </w:r>
     </w:p>
@@ -508,8 +571,14 @@
     <w:p>
       <w:pPr>
         <w:pStyle w:val="Heading1"/>
+        <w:shd w:fill="3333B2"/>
+        <w:spacing w:before="260" w:after="160" w:line="259" w:lineRule="auto"/>
+        <w:ind w:left="102" w:right="0"/>
       </w:pPr>
       <w:r>
+        <w:rPr>
+          <w:color w:val="FFFFFF"/>
+        </w:rPr>
         <w:t>6. Metodologia</w:t>
       </w:r>
     </w:p>
@@ -520,7 +589,7 @@
       <w:r>
         <w:rPr>
           <w:rFonts w:ascii="Consolas" w:hAnsi="Consolas"/>
-          <w:color w:val="17365D"/>
+          <w:color w:val="3333B2"/>
           <w:sz w:val="18"/>
         </w:rPr>
         <w:t>pytest</w:t>
@@ -531,7 +600,7 @@
       <w:r>
         <w:rPr>
           <w:rFonts w:ascii="Consolas" w:hAnsi="Consolas"/>
-          <w:color w:val="17365D"/>
+          <w:color w:val="3333B2"/>
           <w:sz w:val="18"/>
         </w:rPr>
         <w:t>green</w:t>
@@ -542,7 +611,7 @@
       <w:r>
         <w:rPr>
           <w:rFonts w:ascii="Consolas" w:hAnsi="Consolas"/>
-          <w:color w:val="17365D"/>
+          <w:color w:val="3333B2"/>
           <w:sz w:val="18"/>
         </w:rPr>
         <w:t>SIM-*</w:t>
@@ -558,7 +627,7 @@
       <w:r>
         <w:rPr>
           <w:rFonts w:ascii="Consolas" w:hAnsi="Consolas"/>
-          <w:color w:val="17365D"/>
+          <w:color w:val="3333B2"/>
           <w:sz w:val="18"/>
         </w:rPr>
         <w:t>participant_reported_trials.csv</w:t>
@@ -574,7 +643,7 @@
       <w:r>
         <w:rPr>
           <w:rFonts w:ascii="Consolas" w:hAnsi="Consolas"/>
-          <w:color w:val="17365D"/>
+          <w:color w:val="3333B2"/>
           <w:sz w:val="18"/>
         </w:rPr>
         <w:t>solucao.py</w:t>
@@ -585,7 +654,7 @@
       <w:r>
         <w:rPr>
           <w:rFonts w:ascii="Consolas" w:hAnsi="Consolas"/>
-          <w:color w:val="17365D"/>
+          <w:color w:val="3333B2"/>
           <w:sz w:val="18"/>
         </w:rPr>
         <w:t>SIM-*</w:t>
@@ -596,7 +665,7 @@
       <w:r>
         <w:rPr>
           <w:rFonts w:ascii="Consolas" w:hAnsi="Consolas"/>
-          <w:color w:val="17365D"/>
+          <w:color w:val="3333B2"/>
           <w:sz w:val="18"/>
         </w:rPr>
         <w:t>agent_delegated_codex_work</w:t>
@@ -608,8 +677,14 @@
     <w:p>
       <w:pPr>
         <w:pStyle w:val="Heading1"/>
+        <w:shd w:fill="3333B2"/>
+        <w:spacing w:before="260" w:after="160" w:line="259" w:lineRule="auto"/>
+        <w:ind w:left="102" w:right="0"/>
       </w:pPr>
       <w:r>
+        <w:rPr>
+          <w:color w:val="FFFFFF"/>
+        </w:rPr>
         <w:t>7. Participantes</w:t>
       </w:r>
     </w:p>
@@ -623,11 +698,18 @@
     </w:p>
     <w:tbl>
       <w:tblPr>
-        <w:tblStyle w:val="TableGrid"/>
         <w:tblW w:type="auto" w:w="0"/>
         <w:jc w:val="center"/>
         <w:tblLayout w:type="autofit"/>
         <w:tblLook w:firstColumn="1" w:firstRow="1" w:lastColumn="0" w:lastRow="0" w:noHBand="0" w:noVBand="1" w:val="04A0"/>
+        <w:tblBorders>
+          <w:top w:val="single" w:sz="8" w:color="3333B2"/>
+          <w:left w:val="nil"/>
+          <w:bottom w:val="single" w:sz="8" w:color="3333B2"/>
+          <w:right w:val="nil"/>
+          <w:insideH w:val="single" w:sz="4" w:color="D9DCE3"/>
+          <w:insideV w:val="nil"/>
+        </w:tblBorders>
       </w:tblPr>
       <w:tblGrid>
         <w:gridCol w:w="2338"/>
@@ -650,7 +732,7 @@
               <w:end w:w="90" w:type="dxa"/>
             </w:tcMar>
             <w:vAlign w:val="center"/>
-            <w:shd w:fill="17365D"/>
+            <w:shd w:fill="3333B2"/>
           </w:tcPr>
           <w:p>
             <w:pPr>
@@ -678,7 +760,7 @@
               <w:end w:w="90" w:type="dxa"/>
             </w:tcMar>
             <w:vAlign w:val="center"/>
-            <w:shd w:fill="17365D"/>
+            <w:shd w:fill="3333B2"/>
           </w:tcPr>
           <w:p>
             <w:pPr>
@@ -706,7 +788,7 @@
               <w:end w:w="90" w:type="dxa"/>
             </w:tcMar>
             <w:vAlign w:val="center"/>
-            <w:shd w:fill="17365D"/>
+            <w:shd w:fill="3333B2"/>
           </w:tcPr>
           <w:p>
             <w:pPr>
@@ -734,7 +816,7 @@
               <w:end w:w="90" w:type="dxa"/>
             </w:tcMar>
             <w:vAlign w:val="center"/>
-            <w:shd w:fill="17365D"/>
+            <w:shd w:fill="3333B2"/>
           </w:tcPr>
           <w:p>
             <w:pPr>
@@ -872,7 +954,7 @@
               <w:end w:w="90" w:type="dxa"/>
             </w:tcMar>
             <w:vAlign w:val="center"/>
-            <w:shd w:fill="F3F7FA"/>
+            <w:shd w:fill="F4F4FB"/>
           </w:tcPr>
           <w:p>
             <w:pPr>
@@ -898,7 +980,7 @@
               <w:end w:w="90" w:type="dxa"/>
             </w:tcMar>
             <w:vAlign w:val="center"/>
-            <w:shd w:fill="F3F7FA"/>
+            <w:shd w:fill="F4F4FB"/>
           </w:tcPr>
           <w:p>
             <w:pPr>
@@ -924,7 +1006,7 @@
               <w:end w:w="90" w:type="dxa"/>
             </w:tcMar>
             <w:vAlign w:val="center"/>
-            <w:shd w:fill="F3F7FA"/>
+            <w:shd w:fill="F4F4FB"/>
           </w:tcPr>
           <w:p>
             <w:pPr>
@@ -950,7 +1032,7 @@
               <w:end w:w="90" w:type="dxa"/>
             </w:tcMar>
             <w:vAlign w:val="center"/>
-            <w:shd w:fill="F3F7FA"/>
+            <w:shd w:fill="F4F4FB"/>
           </w:tcPr>
           <w:p>
             <w:pPr>
@@ -1086,7 +1168,7 @@
               <w:end w:w="90" w:type="dxa"/>
             </w:tcMar>
             <w:vAlign w:val="center"/>
-            <w:shd w:fill="F3F7FA"/>
+            <w:shd w:fill="F4F4FB"/>
           </w:tcPr>
           <w:p>
             <w:pPr>
@@ -1113,7 +1195,7 @@
               <w:end w:w="90" w:type="dxa"/>
             </w:tcMar>
             <w:vAlign w:val="center"/>
-            <w:shd w:fill="F3F7FA"/>
+            <w:shd w:fill="F4F4FB"/>
           </w:tcPr>
           <w:p>
             <w:pPr>
@@ -1139,7 +1221,7 @@
               <w:end w:w="90" w:type="dxa"/>
             </w:tcMar>
             <w:vAlign w:val="center"/>
-            <w:shd w:fill="F3F7FA"/>
+            <w:shd w:fill="F4F4FB"/>
           </w:tcPr>
           <w:p>
             <w:pPr>
@@ -1165,7 +1247,7 @@
               <w:end w:w="90" w:type="dxa"/>
             </w:tcMar>
             <w:vAlign w:val="center"/>
-            <w:shd w:fill="F3F7FA"/>
+            <w:shd w:fill="F4F4FB"/>
           </w:tcPr>
           <w:p>
             <w:pPr>
@@ -1196,8 +1278,14 @@
     <w:p>
       <w:pPr>
         <w:pStyle w:val="Heading1"/>
+        <w:shd w:fill="3333B2"/>
+        <w:spacing w:before="260" w:after="160" w:line="259" w:lineRule="auto"/>
+        <w:ind w:left="102" w:right="0"/>
       </w:pPr>
       <w:r>
+        <w:rPr>
+          <w:color w:val="FFFFFF"/>
+        </w:rPr>
         <w:t>8. Katas</w:t>
       </w:r>
     </w:p>
@@ -1216,11 +1304,18 @@
     </w:p>
     <w:tbl>
       <w:tblPr>
-        <w:tblStyle w:val="TableGrid"/>
         <w:tblW w:type="auto" w:w="0"/>
         <w:jc w:val="center"/>
         <w:tblLayout w:type="autofit"/>
         <w:tblLook w:firstColumn="1" w:firstRow="1" w:lastColumn="0" w:lastRow="0" w:noHBand="0" w:noVBand="1" w:val="04A0"/>
+        <w:tblBorders>
+          <w:top w:val="single" w:sz="8" w:color="3333B2"/>
+          <w:left w:val="nil"/>
+          <w:bottom w:val="single" w:sz="8" w:color="3333B2"/>
+          <w:right w:val="nil"/>
+          <w:insideH w:val="single" w:sz="4" w:color="D9DCE3"/>
+          <w:insideV w:val="nil"/>
+        </w:tblBorders>
       </w:tblPr>
       <w:tblGrid>
         <w:gridCol w:w="2338"/>
@@ -1243,7 +1338,7 @@
               <w:end w:w="90" w:type="dxa"/>
             </w:tcMar>
             <w:vAlign w:val="center"/>
-            <w:shd w:fill="17365D"/>
+            <w:shd w:fill="3333B2"/>
           </w:tcPr>
           <w:p>
             <w:pPr>
@@ -1271,7 +1366,7 @@
               <w:end w:w="90" w:type="dxa"/>
             </w:tcMar>
             <w:vAlign w:val="center"/>
-            <w:shd w:fill="17365D"/>
+            <w:shd w:fill="3333B2"/>
           </w:tcPr>
           <w:p>
             <w:pPr>
@@ -1299,7 +1394,7 @@
               <w:end w:w="90" w:type="dxa"/>
             </w:tcMar>
             <w:vAlign w:val="center"/>
-            <w:shd w:fill="17365D"/>
+            <w:shd w:fill="3333B2"/>
           </w:tcPr>
           <w:p>
             <w:pPr>
@@ -1327,7 +1422,7 @@
               <w:end w:w="90" w:type="dxa"/>
             </w:tcMar>
             <w:vAlign w:val="center"/>
-            <w:shd w:fill="17365D"/>
+            <w:shd w:fill="3333B2"/>
           </w:tcPr>
           <w:p>
             <w:pPr>
@@ -1465,7 +1560,7 @@
               <w:end w:w="90" w:type="dxa"/>
             </w:tcMar>
             <w:vAlign w:val="center"/>
-            <w:shd w:fill="F3F7FA"/>
+            <w:shd w:fill="F4F4FB"/>
           </w:tcPr>
           <w:p>
             <w:pPr>
@@ -1491,7 +1586,7 @@
               <w:end w:w="90" w:type="dxa"/>
             </w:tcMar>
             <w:vAlign w:val="center"/>
-            <w:shd w:fill="F3F7FA"/>
+            <w:shd w:fill="F4F4FB"/>
           </w:tcPr>
           <w:p>
             <w:pPr>
@@ -1517,7 +1612,7 @@
               <w:end w:w="90" w:type="dxa"/>
             </w:tcMar>
             <w:vAlign w:val="center"/>
-            <w:shd w:fill="F3F7FA"/>
+            <w:shd w:fill="F4F4FB"/>
           </w:tcPr>
           <w:p>
             <w:pPr>
@@ -1543,7 +1638,7 @@
               <w:end w:w="90" w:type="dxa"/>
             </w:tcMar>
             <w:vAlign w:val="center"/>
-            <w:shd w:fill="F3F7FA"/>
+            <w:shd w:fill="F4F4FB"/>
           </w:tcPr>
           <w:p>
             <w:pPr>
@@ -1679,7 +1774,7 @@
               <w:end w:w="90" w:type="dxa"/>
             </w:tcMar>
             <w:vAlign w:val="center"/>
-            <w:shd w:fill="F3F7FA"/>
+            <w:shd w:fill="F4F4FB"/>
           </w:tcPr>
           <w:p>
             <w:pPr>
@@ -1705,7 +1800,7 @@
               <w:end w:w="90" w:type="dxa"/>
             </w:tcMar>
             <w:vAlign w:val="center"/>
-            <w:shd w:fill="F3F7FA"/>
+            <w:shd w:fill="F4F4FB"/>
           </w:tcPr>
           <w:p>
             <w:pPr>
@@ -1731,7 +1826,7 @@
               <w:end w:w="90" w:type="dxa"/>
             </w:tcMar>
             <w:vAlign w:val="center"/>
-            <w:shd w:fill="F3F7FA"/>
+            <w:shd w:fill="F4F4FB"/>
           </w:tcPr>
           <w:p>
             <w:pPr>
@@ -1757,7 +1852,7 @@
               <w:end w:w="90" w:type="dxa"/>
             </w:tcMar>
             <w:vAlign w:val="center"/>
-            <w:shd w:fill="F3F7FA"/>
+            <w:shd w:fill="F4F4FB"/>
           </w:tcPr>
           <w:p>
             <w:pPr>
@@ -1788,8 +1883,14 @@
     <w:p>
       <w:pPr>
         <w:pStyle w:val="Heading1"/>
+        <w:shd w:fill="3333B2"/>
+        <w:spacing w:before="260" w:after="160" w:line="259" w:lineRule="auto"/>
+        <w:ind w:left="102" w:right="0"/>
       </w:pPr>
       <w:r>
+        <w:rPr>
+          <w:color w:val="FFFFFF"/>
+        </w:rPr>
         <w:t>9. Desenho experimental</w:t>
       </w:r>
     </w:p>
@@ -1800,7 +1901,7 @@
       <w:r>
         <w:rPr>
           <w:rFonts w:ascii="Consolas" w:hAnsi="Consolas"/>
-          <w:color w:val="17365D"/>
+          <w:color w:val="3333B2"/>
           <w:sz w:val="18"/>
         </w:rPr>
         <w:t>green</w:t>
@@ -1819,11 +1920,18 @@
     </w:p>
     <w:tbl>
       <w:tblPr>
-        <w:tblStyle w:val="TableGrid"/>
         <w:tblW w:type="auto" w:w="0"/>
         <w:jc w:val="center"/>
         <w:tblLayout w:type="autofit"/>
         <w:tblLook w:firstColumn="1" w:firstRow="1" w:lastColumn="0" w:lastRow="0" w:noHBand="0" w:noVBand="1" w:val="04A0"/>
+        <w:tblBorders>
+          <w:top w:val="single" w:sz="8" w:color="3333B2"/>
+          <w:left w:val="nil"/>
+          <w:bottom w:val="single" w:sz="8" w:color="3333B2"/>
+          <w:right w:val="nil"/>
+          <w:insideH w:val="single" w:sz="4" w:color="D9DCE3"/>
+          <w:insideV w:val="nil"/>
+        </w:tblBorders>
       </w:tblPr>
       <w:tblGrid>
         <w:gridCol w:w="1169"/>
@@ -1850,7 +1958,7 @@
               <w:end w:w="90" w:type="dxa"/>
             </w:tcMar>
             <w:vAlign w:val="center"/>
-            <w:shd w:fill="17365D"/>
+            <w:shd w:fill="3333B2"/>
           </w:tcPr>
           <w:p>
             <w:pPr>
@@ -1878,7 +1986,7 @@
               <w:end w:w="90" w:type="dxa"/>
             </w:tcMar>
             <w:vAlign w:val="center"/>
-            <w:shd w:fill="17365D"/>
+            <w:shd w:fill="3333B2"/>
           </w:tcPr>
           <w:p>
             <w:pPr>
@@ -1906,7 +2014,7 @@
               <w:end w:w="90" w:type="dxa"/>
             </w:tcMar>
             <w:vAlign w:val="center"/>
-            <w:shd w:fill="17365D"/>
+            <w:shd w:fill="3333B2"/>
           </w:tcPr>
           <w:p>
             <w:pPr>
@@ -1934,7 +2042,7 @@
               <w:end w:w="90" w:type="dxa"/>
             </w:tcMar>
             <w:vAlign w:val="center"/>
-            <w:shd w:fill="17365D"/>
+            <w:shd w:fill="3333B2"/>
           </w:tcPr>
           <w:p>
             <w:pPr>
@@ -1962,7 +2070,7 @@
               <w:end w:w="90" w:type="dxa"/>
             </w:tcMar>
             <w:vAlign w:val="center"/>
-            <w:shd w:fill="17365D"/>
+            <w:shd w:fill="3333B2"/>
           </w:tcPr>
           <w:p>
             <w:pPr>
@@ -1990,7 +2098,7 @@
               <w:end w:w="90" w:type="dxa"/>
             </w:tcMar>
             <w:vAlign w:val="center"/>
-            <w:shd w:fill="17365D"/>
+            <w:shd w:fill="3333B2"/>
           </w:tcPr>
           <w:p>
             <w:pPr>
@@ -2018,7 +2126,7 @@
               <w:end w:w="90" w:type="dxa"/>
             </w:tcMar>
             <w:vAlign w:val="center"/>
-            <w:shd w:fill="17365D"/>
+            <w:shd w:fill="3333B2"/>
           </w:tcPr>
           <w:p>
             <w:pPr>
@@ -2046,7 +2154,7 @@
               <w:end w:w="90" w:type="dxa"/>
             </w:tcMar>
             <w:vAlign w:val="center"/>
-            <w:shd w:fill="17365D"/>
+            <w:shd w:fill="3333B2"/>
           </w:tcPr>
           <w:p>
             <w:pPr>
@@ -2284,7 +2392,7 @@
               <w:end w:w="90" w:type="dxa"/>
             </w:tcMar>
             <w:vAlign w:val="center"/>
-            <w:shd w:fill="F3F7FA"/>
+            <w:shd w:fill="F4F4FB"/>
           </w:tcPr>
           <w:p>
             <w:pPr>
@@ -2310,7 +2418,7 @@
               <w:end w:w="90" w:type="dxa"/>
             </w:tcMar>
             <w:vAlign w:val="center"/>
-            <w:shd w:fill="F3F7FA"/>
+            <w:shd w:fill="F4F4FB"/>
           </w:tcPr>
           <w:p>
             <w:pPr>
@@ -2336,7 +2444,7 @@
               <w:end w:w="90" w:type="dxa"/>
             </w:tcMar>
             <w:vAlign w:val="center"/>
-            <w:shd w:fill="F3F7FA"/>
+            <w:shd w:fill="F4F4FB"/>
           </w:tcPr>
           <w:p>
             <w:pPr>
@@ -2362,7 +2470,7 @@
               <w:end w:w="90" w:type="dxa"/>
             </w:tcMar>
             <w:vAlign w:val="center"/>
-            <w:shd w:fill="F3F7FA"/>
+            <w:shd w:fill="F4F4FB"/>
           </w:tcPr>
           <w:p>
             <w:pPr>
@@ -2388,7 +2496,7 @@
               <w:end w:w="90" w:type="dxa"/>
             </w:tcMar>
             <w:vAlign w:val="center"/>
-            <w:shd w:fill="F3F7FA"/>
+            <w:shd w:fill="F4F4FB"/>
           </w:tcPr>
           <w:p>
             <w:pPr>
@@ -2414,7 +2522,7 @@
               <w:end w:w="90" w:type="dxa"/>
             </w:tcMar>
             <w:vAlign w:val="center"/>
-            <w:shd w:fill="F3F7FA"/>
+            <w:shd w:fill="F4F4FB"/>
           </w:tcPr>
           <w:p>
             <w:pPr>
@@ -2440,7 +2548,7 @@
               <w:end w:w="90" w:type="dxa"/>
             </w:tcMar>
             <w:vAlign w:val="center"/>
-            <w:shd w:fill="F3F7FA"/>
+            <w:shd w:fill="F4F4FB"/>
           </w:tcPr>
           <w:p>
             <w:pPr>
@@ -2466,7 +2574,7 @@
               <w:end w:w="90" w:type="dxa"/>
             </w:tcMar>
             <w:vAlign w:val="center"/>
-            <w:shd w:fill="F3F7FA"/>
+            <w:shd w:fill="F4F4FB"/>
           </w:tcPr>
           <w:p>
             <w:pPr>
@@ -2702,7 +2810,7 @@
               <w:end w:w="90" w:type="dxa"/>
             </w:tcMar>
             <w:vAlign w:val="center"/>
-            <w:shd w:fill="F3F7FA"/>
+            <w:shd w:fill="F4F4FB"/>
           </w:tcPr>
           <w:p>
             <w:pPr>
@@ -2728,7 +2836,7 @@
               <w:end w:w="90" w:type="dxa"/>
             </w:tcMar>
             <w:vAlign w:val="center"/>
-            <w:shd w:fill="F3F7FA"/>
+            <w:shd w:fill="F4F4FB"/>
           </w:tcPr>
           <w:p>
             <w:pPr>
@@ -2754,7 +2862,7 @@
               <w:end w:w="90" w:type="dxa"/>
             </w:tcMar>
             <w:vAlign w:val="center"/>
-            <w:shd w:fill="F3F7FA"/>
+            <w:shd w:fill="F4F4FB"/>
           </w:tcPr>
           <w:p>
             <w:pPr>
@@ -2780,7 +2888,7 @@
               <w:end w:w="90" w:type="dxa"/>
             </w:tcMar>
             <w:vAlign w:val="center"/>
-            <w:shd w:fill="F3F7FA"/>
+            <w:shd w:fill="F4F4FB"/>
           </w:tcPr>
           <w:p>
             <w:pPr>
@@ -2806,7 +2914,7 @@
               <w:end w:w="90" w:type="dxa"/>
             </w:tcMar>
             <w:vAlign w:val="center"/>
-            <w:shd w:fill="F3F7FA"/>
+            <w:shd w:fill="F4F4FB"/>
           </w:tcPr>
           <w:p>
             <w:pPr>
@@ -2832,7 +2940,7 @@
               <w:end w:w="90" w:type="dxa"/>
             </w:tcMar>
             <w:vAlign w:val="center"/>
-            <w:shd w:fill="F3F7FA"/>
+            <w:shd w:fill="F4F4FB"/>
           </w:tcPr>
           <w:p>
             <w:pPr>
@@ -2858,7 +2966,7 @@
               <w:end w:w="90" w:type="dxa"/>
             </w:tcMar>
             <w:vAlign w:val="center"/>
-            <w:shd w:fill="F3F7FA"/>
+            <w:shd w:fill="F4F4FB"/>
           </w:tcPr>
           <w:p>
             <w:pPr>
@@ -2884,7 +2992,7 @@
               <w:end w:w="90" w:type="dxa"/>
             </w:tcMar>
             <w:vAlign w:val="center"/>
-            <w:shd w:fill="F3F7FA"/>
+            <w:shd w:fill="F4F4FB"/>
           </w:tcPr>
           <w:p>
             <w:pPr>
@@ -3120,7 +3228,7 @@
               <w:end w:w="90" w:type="dxa"/>
             </w:tcMar>
             <w:vAlign w:val="center"/>
-            <w:shd w:fill="F3F7FA"/>
+            <w:shd w:fill="F4F4FB"/>
           </w:tcPr>
           <w:p>
             <w:pPr>
@@ -3146,7 +3254,7 @@
               <w:end w:w="90" w:type="dxa"/>
             </w:tcMar>
             <w:vAlign w:val="center"/>
-            <w:shd w:fill="F3F7FA"/>
+            <w:shd w:fill="F4F4FB"/>
           </w:tcPr>
           <w:p>
             <w:pPr>
@@ -3172,7 +3280,7 @@
               <w:end w:w="90" w:type="dxa"/>
             </w:tcMar>
             <w:vAlign w:val="center"/>
-            <w:shd w:fill="F3F7FA"/>
+            <w:shd w:fill="F4F4FB"/>
           </w:tcPr>
           <w:p>
             <w:pPr>
@@ -3198,7 +3306,7 @@
               <w:end w:w="90" w:type="dxa"/>
             </w:tcMar>
             <w:vAlign w:val="center"/>
-            <w:shd w:fill="F3F7FA"/>
+            <w:shd w:fill="F4F4FB"/>
           </w:tcPr>
           <w:p>
             <w:pPr>
@@ -3224,7 +3332,7 @@
               <w:end w:w="90" w:type="dxa"/>
             </w:tcMar>
             <w:vAlign w:val="center"/>
-            <w:shd w:fill="F3F7FA"/>
+            <w:shd w:fill="F4F4FB"/>
           </w:tcPr>
           <w:p>
             <w:pPr>
@@ -3250,7 +3358,7 @@
               <w:end w:w="90" w:type="dxa"/>
             </w:tcMar>
             <w:vAlign w:val="center"/>
-            <w:shd w:fill="F3F7FA"/>
+            <w:shd w:fill="F4F4FB"/>
           </w:tcPr>
           <w:p>
             <w:pPr>
@@ -3276,7 +3384,7 @@
               <w:end w:w="90" w:type="dxa"/>
             </w:tcMar>
             <w:vAlign w:val="center"/>
-            <w:shd w:fill="F3F7FA"/>
+            <w:shd w:fill="F4F4FB"/>
           </w:tcPr>
           <w:p>
             <w:pPr>
@@ -3302,7 +3410,7 @@
               <w:end w:w="90" w:type="dxa"/>
             </w:tcMar>
             <w:vAlign w:val="center"/>
-            <w:shd w:fill="F3F7FA"/>
+            <w:shd w:fill="F4F4FB"/>
           </w:tcPr>
           <w:p>
             <w:pPr>
@@ -3538,7 +3646,7 @@
               <w:end w:w="90" w:type="dxa"/>
             </w:tcMar>
             <w:vAlign w:val="center"/>
-            <w:shd w:fill="F3F7FA"/>
+            <w:shd w:fill="F4F4FB"/>
           </w:tcPr>
           <w:p>
             <w:pPr>
@@ -3564,7 +3672,7 @@
               <w:end w:w="90" w:type="dxa"/>
             </w:tcMar>
             <w:vAlign w:val="center"/>
-            <w:shd w:fill="F3F7FA"/>
+            <w:shd w:fill="F4F4FB"/>
           </w:tcPr>
           <w:p>
             <w:pPr>
@@ -3590,7 +3698,7 @@
               <w:end w:w="90" w:type="dxa"/>
             </w:tcMar>
             <w:vAlign w:val="center"/>
-            <w:shd w:fill="F3F7FA"/>
+            <w:shd w:fill="F4F4FB"/>
           </w:tcPr>
           <w:p>
             <w:pPr>
@@ -3616,7 +3724,7 @@
               <w:end w:w="90" w:type="dxa"/>
             </w:tcMar>
             <w:vAlign w:val="center"/>
-            <w:shd w:fill="F3F7FA"/>
+            <w:shd w:fill="F4F4FB"/>
           </w:tcPr>
           <w:p>
             <w:pPr>
@@ -3642,7 +3750,7 @@
               <w:end w:w="90" w:type="dxa"/>
             </w:tcMar>
             <w:vAlign w:val="center"/>
-            <w:shd w:fill="F3F7FA"/>
+            <w:shd w:fill="F4F4FB"/>
           </w:tcPr>
           <w:p>
             <w:pPr>
@@ -3668,7 +3776,7 @@
               <w:end w:w="90" w:type="dxa"/>
             </w:tcMar>
             <w:vAlign w:val="center"/>
-            <w:shd w:fill="F3F7FA"/>
+            <w:shd w:fill="F4F4FB"/>
           </w:tcPr>
           <w:p>
             <w:pPr>
@@ -3694,7 +3802,7 @@
               <w:end w:w="90" w:type="dxa"/>
             </w:tcMar>
             <w:vAlign w:val="center"/>
-            <w:shd w:fill="F3F7FA"/>
+            <w:shd w:fill="F4F4FB"/>
           </w:tcPr>
           <w:p>
             <w:pPr>
@@ -3720,7 +3828,7 @@
               <w:end w:w="90" w:type="dxa"/>
             </w:tcMar>
             <w:vAlign w:val="center"/>
-            <w:shd w:fill="F3F7FA"/>
+            <w:shd w:fill="F4F4FB"/>
           </w:tcPr>
           <w:p>
             <w:pPr>
@@ -3956,7 +4064,7 @@
               <w:end w:w="90" w:type="dxa"/>
             </w:tcMar>
             <w:vAlign w:val="center"/>
-            <w:shd w:fill="F3F7FA"/>
+            <w:shd w:fill="F4F4FB"/>
           </w:tcPr>
           <w:p>
             <w:pPr>
@@ -3982,7 +4090,7 @@
               <w:end w:w="90" w:type="dxa"/>
             </w:tcMar>
             <w:vAlign w:val="center"/>
-            <w:shd w:fill="F3F7FA"/>
+            <w:shd w:fill="F4F4FB"/>
           </w:tcPr>
           <w:p>
             <w:pPr>
@@ -4008,7 +4116,7 @@
               <w:end w:w="90" w:type="dxa"/>
             </w:tcMar>
             <w:vAlign w:val="center"/>
-            <w:shd w:fill="F3F7FA"/>
+            <w:shd w:fill="F4F4FB"/>
           </w:tcPr>
           <w:p>
             <w:pPr>
@@ -4034,7 +4142,7 @@
               <w:end w:w="90" w:type="dxa"/>
             </w:tcMar>
             <w:vAlign w:val="center"/>
-            <w:shd w:fill="F3F7FA"/>
+            <w:shd w:fill="F4F4FB"/>
           </w:tcPr>
           <w:p>
             <w:pPr>
@@ -4060,7 +4168,7 @@
               <w:end w:w="90" w:type="dxa"/>
             </w:tcMar>
             <w:vAlign w:val="center"/>
-            <w:shd w:fill="F3F7FA"/>
+            <w:shd w:fill="F4F4FB"/>
           </w:tcPr>
           <w:p>
             <w:pPr>
@@ -4086,7 +4194,7 @@
               <w:end w:w="90" w:type="dxa"/>
             </w:tcMar>
             <w:vAlign w:val="center"/>
-            <w:shd w:fill="F3F7FA"/>
+            <w:shd w:fill="F4F4FB"/>
           </w:tcPr>
           <w:p>
             <w:pPr>
@@ -4112,7 +4220,7 @@
               <w:end w:w="90" w:type="dxa"/>
             </w:tcMar>
             <w:vAlign w:val="center"/>
-            <w:shd w:fill="F3F7FA"/>
+            <w:shd w:fill="F4F4FB"/>
           </w:tcPr>
           <w:p>
             <w:pPr>
@@ -4138,7 +4246,7 @@
               <w:end w:w="90" w:type="dxa"/>
             </w:tcMar>
             <w:vAlign w:val="center"/>
-            <w:shd w:fill="F3F7FA"/>
+            <w:shd w:fill="F4F4FB"/>
           </w:tcPr>
           <w:p>
             <w:pPr>
@@ -4374,7 +4482,7 @@
               <w:end w:w="90" w:type="dxa"/>
             </w:tcMar>
             <w:vAlign w:val="center"/>
-            <w:shd w:fill="F3F7FA"/>
+            <w:shd w:fill="F4F4FB"/>
           </w:tcPr>
           <w:p>
             <w:pPr>
@@ -4400,7 +4508,7 @@
               <w:end w:w="90" w:type="dxa"/>
             </w:tcMar>
             <w:vAlign w:val="center"/>
-            <w:shd w:fill="F3F7FA"/>
+            <w:shd w:fill="F4F4FB"/>
           </w:tcPr>
           <w:p>
             <w:pPr>
@@ -4426,7 +4534,7 @@
               <w:end w:w="90" w:type="dxa"/>
             </w:tcMar>
             <w:vAlign w:val="center"/>
-            <w:shd w:fill="F3F7FA"/>
+            <w:shd w:fill="F4F4FB"/>
           </w:tcPr>
           <w:p>
             <w:pPr>
@@ -4452,7 +4560,7 @@
               <w:end w:w="90" w:type="dxa"/>
             </w:tcMar>
             <w:vAlign w:val="center"/>
-            <w:shd w:fill="F3F7FA"/>
+            <w:shd w:fill="F4F4FB"/>
           </w:tcPr>
           <w:p>
             <w:pPr>
@@ -4478,7 +4586,7 @@
               <w:end w:w="90" w:type="dxa"/>
             </w:tcMar>
             <w:vAlign w:val="center"/>
-            <w:shd w:fill="F3F7FA"/>
+            <w:shd w:fill="F4F4FB"/>
           </w:tcPr>
           <w:p>
             <w:pPr>
@@ -4504,7 +4612,7 @@
               <w:end w:w="90" w:type="dxa"/>
             </w:tcMar>
             <w:vAlign w:val="center"/>
-            <w:shd w:fill="F3F7FA"/>
+            <w:shd w:fill="F4F4FB"/>
           </w:tcPr>
           <w:p>
             <w:pPr>
@@ -4530,7 +4638,7 @@
               <w:end w:w="90" w:type="dxa"/>
             </w:tcMar>
             <w:vAlign w:val="center"/>
-            <w:shd w:fill="F3F7FA"/>
+            <w:shd w:fill="F4F4FB"/>
           </w:tcPr>
           <w:p>
             <w:pPr>
@@ -4556,7 +4664,7 @@
               <w:end w:w="90" w:type="dxa"/>
             </w:tcMar>
             <w:vAlign w:val="center"/>
-            <w:shd w:fill="F3F7FA"/>
+            <w:shd w:fill="F4F4FB"/>
           </w:tcPr>
           <w:p>
             <w:pPr>
@@ -4582,8 +4690,14 @@
     <w:p>
       <w:pPr>
         <w:pStyle w:val="Heading1"/>
+        <w:shd w:fill="3333B2"/>
+        <w:spacing w:before="260" w:after="160" w:line="259" w:lineRule="auto"/>
+        <w:ind w:left="102" w:right="0"/>
       </w:pPr>
       <w:r>
+        <w:rPr>
+          <w:color w:val="FFFFFF"/>
+        </w:rPr>
         <w:t>10. Contrabalanceamento</w:t>
       </w:r>
     </w:p>
@@ -4602,11 +4716,18 @@
     </w:p>
     <w:tbl>
       <w:tblPr>
-        <w:tblStyle w:val="TableGrid"/>
         <w:tblW w:type="auto" w:w="0"/>
         <w:jc w:val="center"/>
         <w:tblLayout w:type="autofit"/>
         <w:tblLook w:firstColumn="1" w:firstRow="1" w:lastColumn="0" w:lastRow="0" w:noHBand="0" w:noVBand="1" w:val="04A0"/>
+        <w:tblBorders>
+          <w:top w:val="single" w:sz="8" w:color="3333B2"/>
+          <w:left w:val="nil"/>
+          <w:bottom w:val="single" w:sz="8" w:color="3333B2"/>
+          <w:right w:val="nil"/>
+          <w:insideH w:val="single" w:sz="4" w:color="D9DCE3"/>
+          <w:insideV w:val="nil"/>
+        </w:tblBorders>
       </w:tblPr>
       <w:tblGrid>
         <w:gridCol w:w="1871"/>
@@ -4630,7 +4751,7 @@
               <w:end w:w="90" w:type="dxa"/>
             </w:tcMar>
             <w:vAlign w:val="center"/>
-            <w:shd w:fill="17365D"/>
+            <w:shd w:fill="3333B2"/>
           </w:tcPr>
           <w:p>
             <w:pPr>
@@ -4658,7 +4779,7 @@
               <w:end w:w="90" w:type="dxa"/>
             </w:tcMar>
             <w:vAlign w:val="center"/>
-            <w:shd w:fill="17365D"/>
+            <w:shd w:fill="3333B2"/>
           </w:tcPr>
           <w:p>
             <w:pPr>
@@ -4686,7 +4807,7 @@
               <w:end w:w="90" w:type="dxa"/>
             </w:tcMar>
             <w:vAlign w:val="center"/>
-            <w:shd w:fill="17365D"/>
+            <w:shd w:fill="3333B2"/>
           </w:tcPr>
           <w:p>
             <w:pPr>
@@ -4714,7 +4835,7 @@
               <w:end w:w="90" w:type="dxa"/>
             </w:tcMar>
             <w:vAlign w:val="center"/>
-            <w:shd w:fill="17365D"/>
+            <w:shd w:fill="3333B2"/>
           </w:tcPr>
           <w:p>
             <w:pPr>
@@ -4742,7 +4863,7 @@
               <w:end w:w="90" w:type="dxa"/>
             </w:tcMar>
             <w:vAlign w:val="center"/>
-            <w:shd w:fill="17365D"/>
+            <w:shd w:fill="3333B2"/>
           </w:tcPr>
           <w:p>
             <w:pPr>
@@ -4905,7 +5026,7 @@
               <w:end w:w="90" w:type="dxa"/>
             </w:tcMar>
             <w:vAlign w:val="center"/>
-            <w:shd w:fill="F3F7FA"/>
+            <w:shd w:fill="F4F4FB"/>
           </w:tcPr>
           <w:p>
             <w:pPr>
@@ -4931,7 +5052,7 @@
               <w:end w:w="90" w:type="dxa"/>
             </w:tcMar>
             <w:vAlign w:val="center"/>
-            <w:shd w:fill="F3F7FA"/>
+            <w:shd w:fill="F4F4FB"/>
           </w:tcPr>
           <w:p>
             <w:pPr>
@@ -4957,7 +5078,7 @@
               <w:end w:w="90" w:type="dxa"/>
             </w:tcMar>
             <w:vAlign w:val="center"/>
-            <w:shd w:fill="F3F7FA"/>
+            <w:shd w:fill="F4F4FB"/>
           </w:tcPr>
           <w:p>
             <w:pPr>
@@ -4983,7 +5104,7 @@
               <w:end w:w="90" w:type="dxa"/>
             </w:tcMar>
             <w:vAlign w:val="center"/>
-            <w:shd w:fill="F3F7FA"/>
+            <w:shd w:fill="F4F4FB"/>
           </w:tcPr>
           <w:p>
             <w:pPr>
@@ -5009,7 +5130,7 @@
               <w:end w:w="90" w:type="dxa"/>
             </w:tcMar>
             <w:vAlign w:val="center"/>
-            <w:shd w:fill="F3F7FA"/>
+            <w:shd w:fill="F4F4FB"/>
           </w:tcPr>
           <w:p>
             <w:pPr>
@@ -5170,8 +5291,14 @@
     <w:p>
       <w:pPr>
         <w:pStyle w:val="Heading1"/>
+        <w:shd w:fill="3333B2"/>
+        <w:spacing w:before="260" w:after="160" w:line="259" w:lineRule="auto"/>
+        <w:ind w:left="102" w:right="0"/>
       </w:pPr>
       <w:r>
+        <w:rPr>
+          <w:color w:val="FFFFFF"/>
+        </w:rPr>
         <w:t>11. Instrumentação</w:t>
       </w:r>
     </w:p>
@@ -5182,7 +5309,7 @@
       <w:r>
         <w:rPr>
           <w:rFonts w:ascii="Consolas" w:hAnsi="Consolas"/>
-          <w:color w:val="17365D"/>
+          <w:color w:val="3333B2"/>
           <w:sz w:val="18"/>
         </w:rPr>
         <w:t>lab02/trials</w:t>
@@ -5193,7 +5320,7 @@
       <w:r>
         <w:rPr>
           <w:rFonts w:ascii="Consolas" w:hAnsi="Consolas"/>
-          <w:color w:val="17365D"/>
+          <w:color w:val="3333B2"/>
           <w:sz w:val="18"/>
         </w:rPr>
         <w:t>trials.csv</w:t>
@@ -5204,7 +5331,7 @@
       <w:r>
         <w:rPr>
           <w:rFonts w:ascii="Consolas" w:hAnsi="Consolas"/>
-          <w:color w:val="17365D"/>
+          <w:color w:val="3333B2"/>
           <w:sz w:val="18"/>
         </w:rPr>
         <w:t>trial_cycles.csv</w:t>
@@ -5221,8 +5348,14 @@
     <w:p>
       <w:pPr>
         <w:pStyle w:val="Heading1"/>
+        <w:shd w:fill="3333B2"/>
+        <w:spacing w:before="260" w:after="160" w:line="259" w:lineRule="auto"/>
+        <w:ind w:left="102" w:right="0"/>
       </w:pPr>
       <w:r>
+        <w:rPr>
+          <w:color w:val="FFFFFF"/>
+        </w:rPr>
         <w:t>12. Métricas</w:t>
       </w:r>
     </w:p>
@@ -5236,11 +5369,18 @@
     </w:p>
     <w:tbl>
       <w:tblPr>
-        <w:tblStyle w:val="TableGrid"/>
         <w:tblW w:type="auto" w:w="0"/>
         <w:jc w:val="center"/>
         <w:tblLayout w:type="autofit"/>
         <w:tblLook w:firstColumn="1" w:firstRow="1" w:lastColumn="0" w:lastRow="0" w:noHBand="0" w:noVBand="1" w:val="04A0"/>
+        <w:tblBorders>
+          <w:top w:val="single" w:sz="8" w:color="3333B2"/>
+          <w:left w:val="nil"/>
+          <w:bottom w:val="single" w:sz="8" w:color="3333B2"/>
+          <w:right w:val="nil"/>
+          <w:insideH w:val="single" w:sz="4" w:color="D9DCE3"/>
+          <w:insideV w:val="nil"/>
+        </w:tblBorders>
       </w:tblPr>
       <w:tblGrid>
         <w:gridCol w:w="3118"/>
@@ -5262,7 +5402,7 @@
               <w:end w:w="90" w:type="dxa"/>
             </w:tcMar>
             <w:vAlign w:val="center"/>
-            <w:shd w:fill="17365D"/>
+            <w:shd w:fill="3333B2"/>
           </w:tcPr>
           <w:p>
             <w:pPr>
@@ -5290,7 +5430,7 @@
               <w:end w:w="90" w:type="dxa"/>
             </w:tcMar>
             <w:vAlign w:val="center"/>
-            <w:shd w:fill="17365D"/>
+            <w:shd w:fill="3333B2"/>
           </w:tcPr>
           <w:p>
             <w:pPr>
@@ -5318,7 +5458,7 @@
               <w:end w:w="90" w:type="dxa"/>
             </w:tcMar>
             <w:vAlign w:val="center"/>
-            <w:shd w:fill="17365D"/>
+            <w:shd w:fill="3333B2"/>
           </w:tcPr>
           <w:p>
             <w:pPr>
@@ -5431,7 +5571,7 @@
               <w:end w:w="90" w:type="dxa"/>
             </w:tcMar>
             <w:vAlign w:val="center"/>
-            <w:shd w:fill="F3F7FA"/>
+            <w:shd w:fill="F4F4FB"/>
           </w:tcPr>
           <w:p>
             <w:pPr>
@@ -5457,7 +5597,7 @@
               <w:end w:w="90" w:type="dxa"/>
             </w:tcMar>
             <w:vAlign w:val="center"/>
-            <w:shd w:fill="F3F7FA"/>
+            <w:shd w:fill="F4F4FB"/>
           </w:tcPr>
           <w:p>
             <w:pPr>
@@ -5483,7 +5623,7 @@
               <w:end w:w="90" w:type="dxa"/>
             </w:tcMar>
             <w:vAlign w:val="center"/>
-            <w:shd w:fill="F3F7FA"/>
+            <w:shd w:fill="F4F4FB"/>
           </w:tcPr>
           <w:p>
             <w:pPr>
@@ -5594,7 +5734,7 @@
               <w:end w:w="90" w:type="dxa"/>
             </w:tcMar>
             <w:vAlign w:val="center"/>
-            <w:shd w:fill="F3F7FA"/>
+            <w:shd w:fill="F4F4FB"/>
           </w:tcPr>
           <w:p>
             <w:pPr>
@@ -5620,7 +5760,7 @@
               <w:end w:w="90" w:type="dxa"/>
             </w:tcMar>
             <w:vAlign w:val="center"/>
-            <w:shd w:fill="F3F7FA"/>
+            <w:shd w:fill="F4F4FB"/>
           </w:tcPr>
           <w:p>
             <w:pPr>
@@ -5646,7 +5786,7 @@
               <w:end w:w="90" w:type="dxa"/>
             </w:tcMar>
             <w:vAlign w:val="center"/>
-            <w:shd w:fill="F3F7FA"/>
+            <w:shd w:fill="F4F4FB"/>
           </w:tcPr>
           <w:p>
             <w:pPr>
@@ -5757,7 +5897,7 @@
               <w:end w:w="90" w:type="dxa"/>
             </w:tcMar>
             <w:vAlign w:val="center"/>
-            <w:shd w:fill="F3F7FA"/>
+            <w:shd w:fill="F4F4FB"/>
           </w:tcPr>
           <w:p>
             <w:pPr>
@@ -5783,7 +5923,7 @@
               <w:end w:w="90" w:type="dxa"/>
             </w:tcMar>
             <w:vAlign w:val="center"/>
-            <w:shd w:fill="F3F7FA"/>
+            <w:shd w:fill="F4F4FB"/>
           </w:tcPr>
           <w:p>
             <w:pPr>
@@ -5809,7 +5949,7 @@
               <w:end w:w="90" w:type="dxa"/>
             </w:tcMar>
             <w:vAlign w:val="center"/>
-            <w:shd w:fill="F3F7FA"/>
+            <w:shd w:fill="F4F4FB"/>
           </w:tcPr>
           <w:p>
             <w:pPr>
@@ -5838,15 +5978,17 @@
       </w:r>
     </w:p>
     <w:p>
-      <w:r>
-        <w:br w:type="page"/>
-      </w:r>
-    </w:p>
-    <w:p>
       <w:pPr>
         <w:pStyle w:val="Heading1"/>
+        <w:pageBreakBefore/>
+        <w:shd w:fill="3333B2"/>
+        <w:spacing w:before="260" w:after="160" w:line="259" w:lineRule="auto"/>
+        <w:ind w:left="102" w:right="0"/>
       </w:pPr>
       <w:r>
+        <w:rPr>
+          <w:color w:val="FFFFFF"/>
+        </w:rPr>
         <w:t>13. RQ1 — Tempo até green</w:t>
       </w:r>
     </w:p>
@@ -5860,11 +6002,18 @@
     </w:p>
     <w:tbl>
       <w:tblPr>
-        <w:tblStyle w:val="TableGrid"/>
         <w:tblW w:type="auto" w:w="0"/>
         <w:jc w:val="center"/>
         <w:tblLayout w:type="autofit"/>
         <w:tblLook w:firstColumn="1" w:firstRow="1" w:lastColumn="0" w:lastRow="0" w:noHBand="0" w:noVBand="1" w:val="04A0"/>
+        <w:tblBorders>
+          <w:top w:val="single" w:sz="8" w:color="3333B2"/>
+          <w:left w:val="nil"/>
+          <w:bottom w:val="single" w:sz="8" w:color="3333B2"/>
+          <w:right w:val="nil"/>
+          <w:insideH w:val="single" w:sz="4" w:color="D9DCE3"/>
+          <w:insideV w:val="nil"/>
+        </w:tblBorders>
       </w:tblPr>
       <w:tblGrid>
         <w:gridCol w:w="1039"/>
@@ -5892,7 +6041,7 @@
               <w:end w:w="90" w:type="dxa"/>
             </w:tcMar>
             <w:vAlign w:val="center"/>
-            <w:shd w:fill="17365D"/>
+            <w:shd w:fill="3333B2"/>
           </w:tcPr>
           <w:p>
             <w:pPr>
@@ -5920,7 +6069,7 @@
               <w:end w:w="90" w:type="dxa"/>
             </w:tcMar>
             <w:vAlign w:val="center"/>
-            <w:shd w:fill="17365D"/>
+            <w:shd w:fill="3333B2"/>
           </w:tcPr>
           <w:p>
             <w:pPr>
@@ -5948,7 +6097,7 @@
               <w:end w:w="90" w:type="dxa"/>
             </w:tcMar>
             <w:vAlign w:val="center"/>
-            <w:shd w:fill="17365D"/>
+            <w:shd w:fill="3333B2"/>
           </w:tcPr>
           <w:p>
             <w:pPr>
@@ -5976,7 +6125,7 @@
               <w:end w:w="90" w:type="dxa"/>
             </w:tcMar>
             <w:vAlign w:val="center"/>
-            <w:shd w:fill="17365D"/>
+            <w:shd w:fill="3333B2"/>
           </w:tcPr>
           <w:p>
             <w:pPr>
@@ -6004,7 +6153,7 @@
               <w:end w:w="90" w:type="dxa"/>
             </w:tcMar>
             <w:vAlign w:val="center"/>
-            <w:shd w:fill="17365D"/>
+            <w:shd w:fill="3333B2"/>
           </w:tcPr>
           <w:p>
             <w:pPr>
@@ -6032,7 +6181,7 @@
               <w:end w:w="90" w:type="dxa"/>
             </w:tcMar>
             <w:vAlign w:val="center"/>
-            <w:shd w:fill="17365D"/>
+            <w:shd w:fill="3333B2"/>
           </w:tcPr>
           <w:p>
             <w:pPr>
@@ -6060,7 +6209,7 @@
               <w:end w:w="90" w:type="dxa"/>
             </w:tcMar>
             <w:vAlign w:val="center"/>
-            <w:shd w:fill="17365D"/>
+            <w:shd w:fill="3333B2"/>
           </w:tcPr>
           <w:p>
             <w:pPr>
@@ -6088,7 +6237,7 @@
               <w:end w:w="90" w:type="dxa"/>
             </w:tcMar>
             <w:vAlign w:val="center"/>
-            <w:shd w:fill="17365D"/>
+            <w:shd w:fill="3333B2"/>
           </w:tcPr>
           <w:p>
             <w:pPr>
@@ -6116,7 +6265,7 @@
               <w:end w:w="90" w:type="dxa"/>
             </w:tcMar>
             <w:vAlign w:val="center"/>
-            <w:shd w:fill="17365D"/>
+            <w:shd w:fill="3333B2"/>
           </w:tcPr>
           <w:p>
             <w:pPr>
@@ -6379,7 +6528,7 @@
               <w:end w:w="90" w:type="dxa"/>
             </w:tcMar>
             <w:vAlign w:val="center"/>
-            <w:shd w:fill="F3F7FA"/>
+            <w:shd w:fill="F4F4FB"/>
           </w:tcPr>
           <w:p>
             <w:pPr>
@@ -6405,7 +6554,7 @@
               <w:end w:w="90" w:type="dxa"/>
             </w:tcMar>
             <w:vAlign w:val="center"/>
-            <w:shd w:fill="F3F7FA"/>
+            <w:shd w:fill="F4F4FB"/>
           </w:tcPr>
           <w:p>
             <w:pPr>
@@ -6431,7 +6580,7 @@
               <w:end w:w="90" w:type="dxa"/>
             </w:tcMar>
             <w:vAlign w:val="center"/>
-            <w:shd w:fill="F3F7FA"/>
+            <w:shd w:fill="F4F4FB"/>
           </w:tcPr>
           <w:p>
             <w:pPr>
@@ -6457,7 +6606,7 @@
               <w:end w:w="90" w:type="dxa"/>
             </w:tcMar>
             <w:vAlign w:val="center"/>
-            <w:shd w:fill="F3F7FA"/>
+            <w:shd w:fill="F4F4FB"/>
           </w:tcPr>
           <w:p>
             <w:pPr>
@@ -6483,7 +6632,7 @@
               <w:end w:w="90" w:type="dxa"/>
             </w:tcMar>
             <w:vAlign w:val="center"/>
-            <w:shd w:fill="F3F7FA"/>
+            <w:shd w:fill="F4F4FB"/>
           </w:tcPr>
           <w:p>
             <w:pPr>
@@ -6509,7 +6658,7 @@
               <w:end w:w="90" w:type="dxa"/>
             </w:tcMar>
             <w:vAlign w:val="center"/>
-            <w:shd w:fill="F3F7FA"/>
+            <w:shd w:fill="F4F4FB"/>
           </w:tcPr>
           <w:p>
             <w:pPr>
@@ -6535,7 +6684,7 @@
               <w:end w:w="90" w:type="dxa"/>
             </w:tcMar>
             <w:vAlign w:val="center"/>
-            <w:shd w:fill="F3F7FA"/>
+            <w:shd w:fill="F4F4FB"/>
           </w:tcPr>
           <w:p>
             <w:pPr>
@@ -6561,7 +6710,7 @@
               <w:end w:w="90" w:type="dxa"/>
             </w:tcMar>
             <w:vAlign w:val="center"/>
-            <w:shd w:fill="F3F7FA"/>
+            <w:shd w:fill="F4F4FB"/>
           </w:tcPr>
           <w:p>
             <w:pPr>
@@ -6587,7 +6736,7 @@
               <w:end w:w="90" w:type="dxa"/>
             </w:tcMar>
             <w:vAlign w:val="center"/>
-            <w:shd w:fill="F3F7FA"/>
+            <w:shd w:fill="F4F4FB"/>
           </w:tcPr>
           <w:p>
             <w:pPr>
@@ -6609,6 +6758,62 @@
       <w:pPr>
         <w:spacing w:after="20"/>
       </w:pPr>
+    </w:p>
+    <w:p>
+      <w:pPr>
+        <w:shd w:fill="F4F4FB"/>
+        <w:keepLines/>
+        <w:pBdr>
+          <w:left w:val="single" w:sz="22" w:space="10" w:color="3333B2"/>
+        </w:pBdr>
+        <w:spacing w:before="120" w:after="180" w:line="276" w:lineRule="auto"/>
+        <w:ind w:left="198" w:right="142"/>
+        <w:jc w:val="left"/>
+      </w:pPr>
+      <w:r>
+        <w:rPr>
+          <w:rFonts w:ascii="Arial" w:hAnsi="Arial"/>
+          <w:b/>
+          <w:color w:val="3333B2"/>
+        </w:rPr>
+        <w:t>Resultado-chave — RQ1</w:t>
+      </w:r>
+      <w:r>
+        <w:rPr>
+          <w:rFonts w:ascii="Arial" w:hAnsi="Arial"/>
+        </w:rPr>
+        <w:br/>
+      </w:r>
+      <w:r>
+        <w:rPr>
+          <w:rFonts w:ascii="Arial" w:hAnsi="Arial"/>
+        </w:rPr>
+        <w:t>IA: mediana de 112,50 s</w:t>
+      </w:r>
+      <w:r>
+        <w:rPr>
+          <w:rFonts w:ascii="Arial" w:hAnsi="Arial"/>
+        </w:rPr>
+        <w:br/>
+      </w:r>
+      <w:r>
+        <w:rPr>
+          <w:rFonts w:ascii="Arial" w:hAnsi="Arial"/>
+        </w:rPr>
+        <w:t>Manual: mediana de 167,595 s</w:t>
+      </w:r>
+      <w:r>
+        <w:rPr>
+          <w:rFonts w:ascii="Arial" w:hAnsi="Arial"/>
+        </w:rPr>
+        <w:br/>
+      </w:r>
+      <w:r>
+        <w:rPr>
+          <w:rFonts w:ascii="Arial" w:hAnsi="Arial"/>
+        </w:rPr>
+        <w:t>Wilcoxon: p = 0,75</w:t>
+      </w:r>
     </w:p>
     <w:p>
       <w:r>
@@ -6674,11 +6879,18 @@
     </w:p>
     <w:tbl>
       <w:tblPr>
-        <w:tblStyle w:val="TableGrid"/>
         <w:tblW w:type="auto" w:w="0"/>
         <w:jc w:val="center"/>
         <w:tblLayout w:type="autofit"/>
         <w:tblLook w:firstColumn="1" w:firstRow="1" w:lastColumn="0" w:lastRow="0" w:noHBand="0" w:noVBand="1" w:val="04A0"/>
+        <w:tblBorders>
+          <w:top w:val="single" w:sz="8" w:color="3333B2"/>
+          <w:left w:val="nil"/>
+          <w:bottom w:val="single" w:sz="8" w:color="3333B2"/>
+          <w:right w:val="nil"/>
+          <w:insideH w:val="single" w:sz="4" w:color="D9DCE3"/>
+          <w:insideV w:val="nil"/>
+        </w:tblBorders>
       </w:tblPr>
       <w:tblGrid>
         <w:gridCol w:w="2338"/>
@@ -6701,7 +6913,7 @@
               <w:end w:w="90" w:type="dxa"/>
             </w:tcMar>
             <w:vAlign w:val="center"/>
-            <w:shd w:fill="17365D"/>
+            <w:shd w:fill="3333B2"/>
           </w:tcPr>
           <w:p>
             <w:pPr>
@@ -6729,7 +6941,7 @@
               <w:end w:w="90" w:type="dxa"/>
             </w:tcMar>
             <w:vAlign w:val="center"/>
-            <w:shd w:fill="17365D"/>
+            <w:shd w:fill="3333B2"/>
           </w:tcPr>
           <w:p>
             <w:pPr>
@@ -6757,7 +6969,7 @@
               <w:end w:w="90" w:type="dxa"/>
             </w:tcMar>
             <w:vAlign w:val="center"/>
-            <w:shd w:fill="17365D"/>
+            <w:shd w:fill="3333B2"/>
           </w:tcPr>
           <w:p>
             <w:pPr>
@@ -6785,7 +6997,7 @@
               <w:end w:w="90" w:type="dxa"/>
             </w:tcMar>
             <w:vAlign w:val="center"/>
-            <w:shd w:fill="17365D"/>
+            <w:shd w:fill="3333B2"/>
           </w:tcPr>
           <w:p>
             <w:pPr>
@@ -6923,7 +7135,7 @@
               <w:end w:w="90" w:type="dxa"/>
             </w:tcMar>
             <w:vAlign w:val="center"/>
-            <w:shd w:fill="F3F7FA"/>
+            <w:shd w:fill="F4F4FB"/>
           </w:tcPr>
           <w:p>
             <w:pPr>
@@ -6949,7 +7161,7 @@
               <w:end w:w="90" w:type="dxa"/>
             </w:tcMar>
             <w:vAlign w:val="center"/>
-            <w:shd w:fill="F3F7FA"/>
+            <w:shd w:fill="F4F4FB"/>
           </w:tcPr>
           <w:p>
             <w:pPr>
@@ -6975,7 +7187,7 @@
               <w:end w:w="90" w:type="dxa"/>
             </w:tcMar>
             <w:vAlign w:val="center"/>
-            <w:shd w:fill="F3F7FA"/>
+            <w:shd w:fill="F4F4FB"/>
           </w:tcPr>
           <w:p>
             <w:pPr>
@@ -7001,7 +7213,7 @@
               <w:end w:w="90" w:type="dxa"/>
             </w:tcMar>
             <w:vAlign w:val="center"/>
-            <w:shd w:fill="F3F7FA"/>
+            <w:shd w:fill="F4F4FB"/>
           </w:tcPr>
           <w:p>
             <w:pPr>
@@ -7214,8 +7426,14 @@
     <w:p>
       <w:pPr>
         <w:pStyle w:val="Heading1"/>
+        <w:shd w:fill="3333B2"/>
+        <w:spacing w:before="260" w:after="160" w:line="259" w:lineRule="auto"/>
+        <w:ind w:left="102" w:right="0"/>
       </w:pPr>
       <w:r>
+        <w:rPr>
+          <w:color w:val="FFFFFF"/>
+        </w:rPr>
         <w:t>14. RQ2 — Resultado dos testes de aceitação</w:t>
       </w:r>
     </w:p>
@@ -7229,11 +7447,18 @@
     </w:p>
     <w:tbl>
       <w:tblPr>
-        <w:tblStyle w:val="TableGrid"/>
         <w:tblW w:type="auto" w:w="0"/>
         <w:jc w:val="center"/>
         <w:tblLayout w:type="autofit"/>
         <w:tblLook w:firstColumn="1" w:firstRow="1" w:lastColumn="0" w:lastRow="0" w:noHBand="0" w:noVBand="1" w:val="04A0"/>
+        <w:tblBorders>
+          <w:top w:val="single" w:sz="8" w:color="3333B2"/>
+          <w:left w:val="nil"/>
+          <w:bottom w:val="single" w:sz="8" w:color="3333B2"/>
+          <w:right w:val="nil"/>
+          <w:insideH w:val="single" w:sz="4" w:color="D9DCE3"/>
+          <w:insideV w:val="nil"/>
+        </w:tblBorders>
       </w:tblPr>
       <w:tblGrid>
         <w:gridCol w:w="1169"/>
@@ -7260,7 +7485,7 @@
               <w:end w:w="90" w:type="dxa"/>
             </w:tcMar>
             <w:vAlign w:val="center"/>
-            <w:shd w:fill="17365D"/>
+            <w:shd w:fill="3333B2"/>
           </w:tcPr>
           <w:p>
             <w:pPr>
@@ -7288,7 +7513,7 @@
               <w:end w:w="90" w:type="dxa"/>
             </w:tcMar>
             <w:vAlign w:val="center"/>
-            <w:shd w:fill="17365D"/>
+            <w:shd w:fill="3333B2"/>
           </w:tcPr>
           <w:p>
             <w:pPr>
@@ -7316,7 +7541,7 @@
               <w:end w:w="90" w:type="dxa"/>
             </w:tcMar>
             <w:vAlign w:val="center"/>
-            <w:shd w:fill="17365D"/>
+            <w:shd w:fill="3333B2"/>
           </w:tcPr>
           <w:p>
             <w:pPr>
@@ -7344,7 +7569,7 @@
               <w:end w:w="90" w:type="dxa"/>
             </w:tcMar>
             <w:vAlign w:val="center"/>
-            <w:shd w:fill="17365D"/>
+            <w:shd w:fill="3333B2"/>
           </w:tcPr>
           <w:p>
             <w:pPr>
@@ -7372,7 +7597,7 @@
               <w:end w:w="90" w:type="dxa"/>
             </w:tcMar>
             <w:vAlign w:val="center"/>
-            <w:shd w:fill="17365D"/>
+            <w:shd w:fill="3333B2"/>
           </w:tcPr>
           <w:p>
             <w:pPr>
@@ -7400,7 +7625,7 @@
               <w:end w:w="90" w:type="dxa"/>
             </w:tcMar>
             <w:vAlign w:val="center"/>
-            <w:shd w:fill="17365D"/>
+            <w:shd w:fill="3333B2"/>
           </w:tcPr>
           <w:p>
             <w:pPr>
@@ -7428,7 +7653,7 @@
               <w:end w:w="90" w:type="dxa"/>
             </w:tcMar>
             <w:vAlign w:val="center"/>
-            <w:shd w:fill="17365D"/>
+            <w:shd w:fill="3333B2"/>
           </w:tcPr>
           <w:p>
             <w:pPr>
@@ -7456,7 +7681,7 @@
               <w:end w:w="90" w:type="dxa"/>
             </w:tcMar>
             <w:vAlign w:val="center"/>
-            <w:shd w:fill="17365D"/>
+            <w:shd w:fill="3333B2"/>
           </w:tcPr>
           <w:p>
             <w:pPr>
@@ -7694,7 +7919,7 @@
               <w:end w:w="90" w:type="dxa"/>
             </w:tcMar>
             <w:vAlign w:val="center"/>
-            <w:shd w:fill="F3F7FA"/>
+            <w:shd w:fill="F4F4FB"/>
           </w:tcPr>
           <w:p>
             <w:pPr>
@@ -7720,7 +7945,7 @@
               <w:end w:w="90" w:type="dxa"/>
             </w:tcMar>
             <w:vAlign w:val="center"/>
-            <w:shd w:fill="F3F7FA"/>
+            <w:shd w:fill="F4F4FB"/>
           </w:tcPr>
           <w:p>
             <w:pPr>
@@ -7746,7 +7971,7 @@
               <w:end w:w="90" w:type="dxa"/>
             </w:tcMar>
             <w:vAlign w:val="center"/>
-            <w:shd w:fill="F3F7FA"/>
+            <w:shd w:fill="F4F4FB"/>
           </w:tcPr>
           <w:p>
             <w:pPr>
@@ -7772,7 +7997,7 @@
               <w:end w:w="90" w:type="dxa"/>
             </w:tcMar>
             <w:vAlign w:val="center"/>
-            <w:shd w:fill="F3F7FA"/>
+            <w:shd w:fill="F4F4FB"/>
           </w:tcPr>
           <w:p>
             <w:pPr>
@@ -7798,7 +8023,7 @@
               <w:end w:w="90" w:type="dxa"/>
             </w:tcMar>
             <w:vAlign w:val="center"/>
-            <w:shd w:fill="F3F7FA"/>
+            <w:shd w:fill="F4F4FB"/>
           </w:tcPr>
           <w:p>
             <w:pPr>
@@ -7824,7 +8049,7 @@
               <w:end w:w="90" w:type="dxa"/>
             </w:tcMar>
             <w:vAlign w:val="center"/>
-            <w:shd w:fill="F3F7FA"/>
+            <w:shd w:fill="F4F4FB"/>
           </w:tcPr>
           <w:p>
             <w:pPr>
@@ -7850,7 +8075,7 @@
               <w:end w:w="90" w:type="dxa"/>
             </w:tcMar>
             <w:vAlign w:val="center"/>
-            <w:shd w:fill="F3F7FA"/>
+            <w:shd w:fill="F4F4FB"/>
           </w:tcPr>
           <w:p>
             <w:pPr>
@@ -7876,7 +8101,7 @@
               <w:end w:w="90" w:type="dxa"/>
             </w:tcMar>
             <w:vAlign w:val="center"/>
-            <w:shd w:fill="F3F7FA"/>
+            <w:shd w:fill="F4F4FB"/>
           </w:tcPr>
           <w:p>
             <w:pPr>
@@ -7900,13 +8125,69 @@
       </w:pPr>
     </w:p>
     <w:p>
+      <w:pPr>
+        <w:shd w:fill="F4F4FB"/>
+        <w:keepLines/>
+        <w:pBdr>
+          <w:left w:val="single" w:sz="22" w:space="10" w:color="3333B2"/>
+        </w:pBdr>
+        <w:spacing w:before="120" w:after="180" w:line="276" w:lineRule="auto"/>
+        <w:ind w:left="198" w:right="142"/>
+        <w:jc w:val="left"/>
+      </w:pPr>
+      <w:r>
+        <w:rPr>
+          <w:rFonts w:ascii="Arial" w:hAnsi="Arial"/>
+          <w:b/>
+          <w:color w:val="3333B2"/>
+        </w:rPr>
+        <w:t>Resultado-chave — RQ2</w:t>
+      </w:r>
+      <w:r>
+        <w:rPr>
+          <w:rFonts w:ascii="Arial" w:hAnsi="Arial"/>
+        </w:rPr>
+        <w:br/>
+      </w:r>
+      <w:r>
+        <w:rPr>
+          <w:rFonts w:ascii="Arial" w:hAnsi="Arial"/>
+        </w:rPr>
+        <w:t>IA: 54/54 testes passando</w:t>
+      </w:r>
+      <w:r>
+        <w:rPr>
+          <w:rFonts w:ascii="Arial" w:hAnsi="Arial"/>
+        </w:rPr>
+        <w:br/>
+      </w:r>
+      <w:r>
+        <w:rPr>
+          <w:rFonts w:ascii="Arial" w:hAnsi="Arial"/>
+        </w:rPr>
+        <w:t>Manual: 51/51 testes passando</w:t>
+      </w:r>
+      <w:r>
+        <w:rPr>
+          <w:rFonts w:ascii="Arial" w:hAnsi="Arial"/>
+        </w:rPr>
+        <w:br/>
+      </w:r>
+      <w:r>
+        <w:rPr>
+          <w:rFonts w:ascii="Arial" w:hAnsi="Arial"/>
+        </w:rPr>
+        <w:t>Falhas finais: 0 nos dois tratamentos</w:t>
+      </w:r>
+    </w:p>
+    <w:p>
       <w:r>
         <w:t xml:space="preserve">Todos os 105 testes finais passaram. Em Islayder, os resultados foram #21 10/10, #24 9/9, #25 9/9 e #26 7/7, todos </w:t>
       </w:r>
       <w:r>
         <w:rPr>
           <w:rFonts w:ascii="Consolas" w:hAnsi="Consolas"/>
-          <w:color w:val="17365D"/>
+          <w:color w:val="3333B2"/>
           <w:sz w:val="18"/>
         </w:rPr>
         <w:t>green</w:t>
@@ -7979,15 +8260,17 @@
       </w:r>
     </w:p>
     <w:p>
-      <w:r>
-        <w:br w:type="page"/>
-      </w:r>
-    </w:p>
-    <w:p>
       <w:pPr>
         <w:pStyle w:val="Heading1"/>
+        <w:pageBreakBefore/>
+        <w:shd w:fill="3333B2"/>
+        <w:spacing w:before="260" w:after="160" w:line="259" w:lineRule="auto"/>
+        <w:ind w:left="102" w:right="0"/>
       </w:pPr>
       <w:r>
+        <w:rPr>
+          <w:color w:val="FFFFFF"/>
+        </w:rPr>
         <w:t>15. RQ3 — Estrutura do código</w:t>
       </w:r>
     </w:p>
@@ -8001,11 +8284,18 @@
     </w:p>
     <w:tbl>
       <w:tblPr>
-        <w:tblStyle w:val="TableGrid"/>
         <w:tblW w:type="auto" w:w="0"/>
         <w:jc w:val="center"/>
         <w:tblLayout w:type="autofit"/>
         <w:tblLook w:firstColumn="1" w:firstRow="1" w:lastColumn="0" w:lastRow="0" w:noHBand="0" w:noVBand="1" w:val="04A0"/>
+        <w:tblBorders>
+          <w:top w:val="single" w:sz="8" w:color="3333B2"/>
+          <w:left w:val="nil"/>
+          <w:bottom w:val="single" w:sz="8" w:color="3333B2"/>
+          <w:right w:val="nil"/>
+          <w:insideH w:val="single" w:sz="4" w:color="D9DCE3"/>
+          <w:insideV w:val="nil"/>
+        </w:tblBorders>
       </w:tblPr>
       <w:tblGrid>
         <w:gridCol w:w="1336"/>
@@ -8031,7 +8321,7 @@
               <w:end w:w="90" w:type="dxa"/>
             </w:tcMar>
             <w:vAlign w:val="center"/>
-            <w:shd w:fill="17365D"/>
+            <w:shd w:fill="3333B2"/>
           </w:tcPr>
           <w:p>
             <w:pPr>
@@ -8059,7 +8349,7 @@
               <w:end w:w="90" w:type="dxa"/>
             </w:tcMar>
             <w:vAlign w:val="center"/>
-            <w:shd w:fill="17365D"/>
+            <w:shd w:fill="3333B2"/>
           </w:tcPr>
           <w:p>
             <w:pPr>
@@ -8087,7 +8377,7 @@
               <w:end w:w="90" w:type="dxa"/>
             </w:tcMar>
             <w:vAlign w:val="center"/>
-            <w:shd w:fill="17365D"/>
+            <w:shd w:fill="3333B2"/>
           </w:tcPr>
           <w:p>
             <w:pPr>
@@ -8115,7 +8405,7 @@
               <w:end w:w="90" w:type="dxa"/>
             </w:tcMar>
             <w:vAlign w:val="center"/>
-            <w:shd w:fill="17365D"/>
+            <w:shd w:fill="3333B2"/>
           </w:tcPr>
           <w:p>
             <w:pPr>
@@ -8143,7 +8433,7 @@
               <w:end w:w="90" w:type="dxa"/>
             </w:tcMar>
             <w:vAlign w:val="center"/>
-            <w:shd w:fill="17365D"/>
+            <w:shd w:fill="3333B2"/>
           </w:tcPr>
           <w:p>
             <w:pPr>
@@ -8171,7 +8461,7 @@
               <w:end w:w="90" w:type="dxa"/>
             </w:tcMar>
             <w:vAlign w:val="center"/>
-            <w:shd w:fill="17365D"/>
+            <w:shd w:fill="3333B2"/>
           </w:tcPr>
           <w:p>
             <w:pPr>
@@ -8199,7 +8489,7 @@
               <w:end w:w="90" w:type="dxa"/>
             </w:tcMar>
             <w:vAlign w:val="center"/>
-            <w:shd w:fill="17365D"/>
+            <w:shd w:fill="3333B2"/>
           </w:tcPr>
           <w:p>
             <w:pPr>
@@ -8412,7 +8702,7 @@
               <w:end w:w="90" w:type="dxa"/>
             </w:tcMar>
             <w:vAlign w:val="center"/>
-            <w:shd w:fill="F3F7FA"/>
+            <w:shd w:fill="F4F4FB"/>
           </w:tcPr>
           <w:p>
             <w:pPr>
@@ -8438,7 +8728,7 @@
               <w:end w:w="90" w:type="dxa"/>
             </w:tcMar>
             <w:vAlign w:val="center"/>
-            <w:shd w:fill="F3F7FA"/>
+            <w:shd w:fill="F4F4FB"/>
           </w:tcPr>
           <w:p>
             <w:pPr>
@@ -8464,7 +8754,7 @@
               <w:end w:w="90" w:type="dxa"/>
             </w:tcMar>
             <w:vAlign w:val="center"/>
-            <w:shd w:fill="F3F7FA"/>
+            <w:shd w:fill="F4F4FB"/>
           </w:tcPr>
           <w:p>
             <w:pPr>
@@ -8490,7 +8780,7 @@
               <w:end w:w="90" w:type="dxa"/>
             </w:tcMar>
             <w:vAlign w:val="center"/>
-            <w:shd w:fill="F3F7FA"/>
+            <w:shd w:fill="F4F4FB"/>
           </w:tcPr>
           <w:p>
             <w:pPr>
@@ -8516,7 +8806,7 @@
               <w:end w:w="90" w:type="dxa"/>
             </w:tcMar>
             <w:vAlign w:val="center"/>
-            <w:shd w:fill="F3F7FA"/>
+            <w:shd w:fill="F4F4FB"/>
           </w:tcPr>
           <w:p>
             <w:pPr>
@@ -8542,7 +8832,7 @@
               <w:end w:w="90" w:type="dxa"/>
             </w:tcMar>
             <w:vAlign w:val="center"/>
-            <w:shd w:fill="F3F7FA"/>
+            <w:shd w:fill="F4F4FB"/>
           </w:tcPr>
           <w:p>
             <w:pPr>
@@ -8568,7 +8858,7 @@
               <w:end w:w="90" w:type="dxa"/>
             </w:tcMar>
             <w:vAlign w:val="center"/>
-            <w:shd w:fill="F3F7FA"/>
+            <w:shd w:fill="F4F4FB"/>
           </w:tcPr>
           <w:p>
             <w:pPr>
@@ -8779,7 +9069,7 @@
               <w:end w:w="90" w:type="dxa"/>
             </w:tcMar>
             <w:vAlign w:val="center"/>
-            <w:shd w:fill="F3F7FA"/>
+            <w:shd w:fill="F4F4FB"/>
           </w:tcPr>
           <w:p>
             <w:pPr>
@@ -8805,7 +9095,7 @@
               <w:end w:w="90" w:type="dxa"/>
             </w:tcMar>
             <w:vAlign w:val="center"/>
-            <w:shd w:fill="F3F7FA"/>
+            <w:shd w:fill="F4F4FB"/>
           </w:tcPr>
           <w:p>
             <w:pPr>
@@ -8831,7 +9121,7 @@
               <w:end w:w="90" w:type="dxa"/>
             </w:tcMar>
             <w:vAlign w:val="center"/>
-            <w:shd w:fill="F3F7FA"/>
+            <w:shd w:fill="F4F4FB"/>
           </w:tcPr>
           <w:p>
             <w:pPr>
@@ -8857,7 +9147,7 @@
               <w:end w:w="90" w:type="dxa"/>
             </w:tcMar>
             <w:vAlign w:val="center"/>
-            <w:shd w:fill="F3F7FA"/>
+            <w:shd w:fill="F4F4FB"/>
           </w:tcPr>
           <w:p>
             <w:pPr>
@@ -8883,7 +9173,7 @@
               <w:end w:w="90" w:type="dxa"/>
             </w:tcMar>
             <w:vAlign w:val="center"/>
-            <w:shd w:fill="F3F7FA"/>
+            <w:shd w:fill="F4F4FB"/>
           </w:tcPr>
           <w:p>
             <w:pPr>
@@ -8909,7 +9199,7 @@
               <w:end w:w="90" w:type="dxa"/>
             </w:tcMar>
             <w:vAlign w:val="center"/>
-            <w:shd w:fill="F3F7FA"/>
+            <w:shd w:fill="F4F4FB"/>
           </w:tcPr>
           <w:p>
             <w:pPr>
@@ -8935,7 +9225,7 @@
               <w:end w:w="90" w:type="dxa"/>
             </w:tcMar>
             <w:vAlign w:val="center"/>
-            <w:shd w:fill="F3F7FA"/>
+            <w:shd w:fill="F4F4FB"/>
           </w:tcPr>
           <w:p>
             <w:pPr>
@@ -9146,7 +9436,7 @@
               <w:end w:w="90" w:type="dxa"/>
             </w:tcMar>
             <w:vAlign w:val="center"/>
-            <w:shd w:fill="F3F7FA"/>
+            <w:shd w:fill="F4F4FB"/>
           </w:tcPr>
           <w:p>
             <w:pPr>
@@ -9172,7 +9462,7 @@
               <w:end w:w="90" w:type="dxa"/>
             </w:tcMar>
             <w:vAlign w:val="center"/>
-            <w:shd w:fill="F3F7FA"/>
+            <w:shd w:fill="F4F4FB"/>
           </w:tcPr>
           <w:p>
             <w:pPr>
@@ -9198,7 +9488,7 @@
               <w:end w:w="90" w:type="dxa"/>
             </w:tcMar>
             <w:vAlign w:val="center"/>
-            <w:shd w:fill="F3F7FA"/>
+            <w:shd w:fill="F4F4FB"/>
           </w:tcPr>
           <w:p>
             <w:pPr>
@@ -9224,7 +9514,7 @@
               <w:end w:w="90" w:type="dxa"/>
             </w:tcMar>
             <w:vAlign w:val="center"/>
-            <w:shd w:fill="F3F7FA"/>
+            <w:shd w:fill="F4F4FB"/>
           </w:tcPr>
           <w:p>
             <w:pPr>
@@ -9250,7 +9540,7 @@
               <w:end w:w="90" w:type="dxa"/>
             </w:tcMar>
             <w:vAlign w:val="center"/>
-            <w:shd w:fill="F3F7FA"/>
+            <w:shd w:fill="F4F4FB"/>
           </w:tcPr>
           <w:p>
             <w:pPr>
@@ -9276,7 +9566,7 @@
               <w:end w:w="90" w:type="dxa"/>
             </w:tcMar>
             <w:vAlign w:val="center"/>
-            <w:shd w:fill="F3F7FA"/>
+            <w:shd w:fill="F4F4FB"/>
           </w:tcPr>
           <w:p>
             <w:pPr>
@@ -9302,7 +9592,7 @@
               <w:end w:w="90" w:type="dxa"/>
             </w:tcMar>
             <w:vAlign w:val="center"/>
-            <w:shd w:fill="F3F7FA"/>
+            <w:shd w:fill="F4F4FB"/>
           </w:tcPr>
           <w:p>
             <w:pPr>
@@ -9324,6 +9614,62 @@
       <w:pPr>
         <w:spacing w:after="20"/>
       </w:pPr>
+    </w:p>
+    <w:p>
+      <w:pPr>
+        <w:shd w:fill="F4F4FB"/>
+        <w:keepLines/>
+        <w:pBdr>
+          <w:left w:val="single" w:sz="22" w:space="10" w:color="3333B2"/>
+        </w:pBdr>
+        <w:spacing w:before="120" w:after="180" w:line="276" w:lineRule="auto"/>
+        <w:ind w:left="198" w:right="142"/>
+        <w:jc w:val="left"/>
+      </w:pPr>
+      <w:r>
+        <w:rPr>
+          <w:rFonts w:ascii="Arial" w:hAnsi="Arial"/>
+          <w:b/>
+          <w:color w:val="3333B2"/>
+        </w:rPr>
+        <w:t>Resultado-chave — RQ3</w:t>
+      </w:r>
+      <w:r>
+        <w:rPr>
+          <w:rFonts w:ascii="Arial" w:hAnsi="Arial"/>
+        </w:rPr>
+        <w:br/>
+      </w:r>
+      <w:r>
+        <w:rPr>
+          <w:rFonts w:ascii="Arial" w:hAnsi="Arial"/>
+        </w:rPr>
+        <w:t>LOC mediana: IA 15 vs. Manual 11</w:t>
+      </w:r>
+      <w:r>
+        <w:rPr>
+          <w:rFonts w:ascii="Arial" w:hAnsi="Arial"/>
+        </w:rPr>
+        <w:br/>
+      </w:r>
+      <w:r>
+        <w:rPr>
+          <w:rFonts w:ascii="Arial" w:hAnsi="Arial"/>
+        </w:rPr>
+        <w:t>CC média mediana: IA 3,5 vs. Manual 4,0</w:t>
+      </w:r>
+      <w:r>
+        <w:rPr>
+          <w:rFonts w:ascii="Arial" w:hAnsi="Arial"/>
+        </w:rPr>
+        <w:br/>
+      </w:r>
+      <w:r>
+        <w:rPr>
+          <w:rFonts w:ascii="Arial" w:hAnsi="Arial"/>
+        </w:rPr>
+        <w:t>Duplicação: 0% nos 12 artefatos</w:t>
+      </w:r>
     </w:p>
     <w:p>
       <w:r>
@@ -9519,8 +9865,14 @@
     <w:p>
       <w:pPr>
         <w:pStyle w:val="Heading1"/>
+        <w:shd w:fill="3333B2"/>
+        <w:spacing w:before="260" w:after="160" w:line="259" w:lineRule="auto"/>
+        <w:ind w:left="102" w:right="0"/>
       </w:pPr>
       <w:r>
+        <w:rPr>
+          <w:color w:val="FFFFFF"/>
+        </w:rPr>
         <w:t>16. Inovação — Evolução por ciclos</w:t>
       </w:r>
     </w:p>
@@ -9534,11 +9886,18 @@
     </w:p>
     <w:tbl>
       <w:tblPr>
-        <w:tblStyle w:val="TableGrid"/>
         <w:tblW w:type="auto" w:w="0"/>
         <w:jc w:val="center"/>
         <w:tblLayout w:type="autofit"/>
         <w:tblLook w:firstColumn="1" w:firstRow="1" w:lastColumn="0" w:lastRow="0" w:noHBand="0" w:noVBand="1" w:val="04A0"/>
+        <w:tblBorders>
+          <w:top w:val="single" w:sz="8" w:color="3333B2"/>
+          <w:left w:val="nil"/>
+          <w:bottom w:val="single" w:sz="8" w:color="3333B2"/>
+          <w:right w:val="nil"/>
+          <w:insideH w:val="single" w:sz="4" w:color="D9DCE3"/>
+          <w:insideV w:val="nil"/>
+        </w:tblBorders>
       </w:tblPr>
       <w:tblGrid>
         <w:gridCol w:w="1559"/>
@@ -9563,7 +9922,7 @@
               <w:end w:w="90" w:type="dxa"/>
             </w:tcMar>
             <w:vAlign w:val="center"/>
-            <w:shd w:fill="17365D"/>
+            <w:shd w:fill="3333B2"/>
           </w:tcPr>
           <w:p>
             <w:pPr>
@@ -9591,7 +9950,7 @@
               <w:end w:w="90" w:type="dxa"/>
             </w:tcMar>
             <w:vAlign w:val="center"/>
-            <w:shd w:fill="17365D"/>
+            <w:shd w:fill="3333B2"/>
           </w:tcPr>
           <w:p>
             <w:pPr>
@@ -9619,7 +9978,7 @@
               <w:end w:w="90" w:type="dxa"/>
             </w:tcMar>
             <w:vAlign w:val="center"/>
-            <w:shd w:fill="17365D"/>
+            <w:shd w:fill="3333B2"/>
           </w:tcPr>
           <w:p>
             <w:pPr>
@@ -9647,7 +10006,7 @@
               <w:end w:w="90" w:type="dxa"/>
             </w:tcMar>
             <w:vAlign w:val="center"/>
-            <w:shd w:fill="17365D"/>
+            <w:shd w:fill="3333B2"/>
           </w:tcPr>
           <w:p>
             <w:pPr>
@@ -9675,7 +10034,7 @@
               <w:end w:w="90" w:type="dxa"/>
             </w:tcMar>
             <w:vAlign w:val="center"/>
-            <w:shd w:fill="17365D"/>
+            <w:shd w:fill="3333B2"/>
           </w:tcPr>
           <w:p>
             <w:pPr>
@@ -9703,7 +10062,7 @@
               <w:end w:w="90" w:type="dxa"/>
             </w:tcMar>
             <w:vAlign w:val="center"/>
-            <w:shd w:fill="17365D"/>
+            <w:shd w:fill="3333B2"/>
           </w:tcPr>
           <w:p>
             <w:pPr>
@@ -9891,7 +10250,7 @@
               <w:end w:w="90" w:type="dxa"/>
             </w:tcMar>
             <w:vAlign w:val="center"/>
-            <w:shd w:fill="F3F7FA"/>
+            <w:shd w:fill="F4F4FB"/>
           </w:tcPr>
           <w:p>
             <w:pPr>
@@ -9917,7 +10276,7 @@
               <w:end w:w="90" w:type="dxa"/>
             </w:tcMar>
             <w:vAlign w:val="center"/>
-            <w:shd w:fill="F3F7FA"/>
+            <w:shd w:fill="F4F4FB"/>
           </w:tcPr>
           <w:p>
             <w:pPr>
@@ -9943,7 +10302,7 @@
               <w:end w:w="90" w:type="dxa"/>
             </w:tcMar>
             <w:vAlign w:val="center"/>
-            <w:shd w:fill="F3F7FA"/>
+            <w:shd w:fill="F4F4FB"/>
           </w:tcPr>
           <w:p>
             <w:pPr>
@@ -9969,7 +10328,7 @@
               <w:end w:w="90" w:type="dxa"/>
             </w:tcMar>
             <w:vAlign w:val="center"/>
-            <w:shd w:fill="F3F7FA"/>
+            <w:shd w:fill="F4F4FB"/>
           </w:tcPr>
           <w:p>
             <w:pPr>
@@ -9995,7 +10354,7 @@
               <w:end w:w="90" w:type="dxa"/>
             </w:tcMar>
             <w:vAlign w:val="center"/>
-            <w:shd w:fill="F3F7FA"/>
+            <w:shd w:fill="F4F4FB"/>
           </w:tcPr>
           <w:p>
             <w:pPr>
@@ -10021,7 +10380,7 @@
               <w:end w:w="90" w:type="dxa"/>
             </w:tcMar>
             <w:vAlign w:val="center"/>
-            <w:shd w:fill="F3F7FA"/>
+            <w:shd w:fill="F4F4FB"/>
           </w:tcPr>
           <w:p>
             <w:pPr>
@@ -10043,6 +10402,50 @@
       <w:pPr>
         <w:spacing w:after="20"/>
       </w:pPr>
+    </w:p>
+    <w:p>
+      <w:pPr>
+        <w:shd w:fill="F4F4FB"/>
+        <w:keepLines/>
+        <w:pBdr>
+          <w:left w:val="single" w:sz="22" w:space="10" w:color="3333B2"/>
+        </w:pBdr>
+        <w:spacing w:before="120" w:after="180" w:line="276" w:lineRule="auto"/>
+        <w:ind w:left="198" w:right="142"/>
+        <w:jc w:val="left"/>
+      </w:pPr>
+      <w:r>
+        <w:rPr>
+          <w:rFonts w:ascii="Arial" w:hAnsi="Arial"/>
+          <w:b/>
+          <w:color w:val="3333B2"/>
+        </w:rPr>
+        <w:t>Resultado-chave — Inovação</w:t>
+      </w:r>
+      <w:r>
+        <w:rPr>
+          <w:rFonts w:ascii="Arial" w:hAnsi="Arial"/>
+        </w:rPr>
+        <w:br/>
+      </w:r>
+      <w:r>
+        <w:rPr>
+          <w:rFonts w:ascii="Arial" w:hAnsi="Arial"/>
+        </w:rPr>
+        <w:t>IA: mediana de 1 ciclo até green</w:t>
+      </w:r>
+      <w:r>
+        <w:rPr>
+          <w:rFonts w:ascii="Arial" w:hAnsi="Arial"/>
+        </w:rPr>
+        <w:br/>
+      </w:r>
+      <w:r>
+        <w:rPr>
+          <w:rFonts w:ascii="Arial" w:hAnsi="Arial"/>
+        </w:rPr>
+        <w:t>Manual: mediana de 2 ciclos até green</w:t>
+      </w:r>
     </w:p>
     <w:p>
       <w:r>
@@ -10160,8 +10563,14 @@
     <w:p>
       <w:pPr>
         <w:pStyle w:val="Heading1"/>
+        <w:shd w:fill="3333B2"/>
+        <w:spacing w:before="260" w:after="160" w:line="259" w:lineRule="auto"/>
+        <w:ind w:left="102" w:right="0"/>
       </w:pPr>
       <w:r>
+        <w:rPr>
+          <w:color w:val="FFFFFF"/>
+        </w:rPr>
         <w:t>17. Dashboard</w:t>
       </w:r>
     </w:p>
@@ -10239,15 +10648,17 @@
       </w:r>
     </w:p>
     <w:p>
-      <w:r>
-        <w:br w:type="page"/>
-      </w:r>
-    </w:p>
-    <w:p>
       <w:pPr>
         <w:pStyle w:val="Heading1"/>
+        <w:pageBreakBefore/>
+        <w:shd w:fill="3333B2"/>
+        <w:spacing w:before="260" w:after="160" w:line="259" w:lineRule="auto"/>
+        <w:ind w:left="102" w:right="0"/>
       </w:pPr>
       <w:r>
+        <w:rPr>
+          <w:color w:val="FFFFFF"/>
+        </w:rPr>
         <w:t>18. Discussão</w:t>
       </w:r>
     </w:p>
@@ -10269,8 +10680,14 @@
     <w:p>
       <w:pPr>
         <w:pStyle w:val="Heading1"/>
+        <w:shd w:fill="3333B2"/>
+        <w:spacing w:before="260" w:after="160" w:line="259" w:lineRule="auto"/>
+        <w:ind w:left="102" w:right="0"/>
       </w:pPr>
       <w:r>
+        <w:rPr>
+          <w:color w:val="FFFFFF"/>
+        </w:rPr>
         <w:t>19. Ameaças à validade</w:t>
       </w:r>
     </w:p>
@@ -10332,7 +10749,7 @@
       <w:r>
         <w:rPr>
           <w:rFonts w:ascii="Consolas" w:hAnsi="Consolas"/>
-          <w:color w:val="17365D"/>
+          <w:color w:val="3333B2"/>
           <w:sz w:val="18"/>
         </w:rPr>
         <w:t>agent_delegated_codex_work</w:t>
@@ -10400,8 +10817,14 @@
     <w:p>
       <w:pPr>
         <w:pStyle w:val="Heading1"/>
+        <w:shd w:fill="3333B2"/>
+        <w:spacing w:before="260" w:after="160" w:line="259" w:lineRule="auto"/>
+        <w:ind w:left="102" w:right="0"/>
       </w:pPr>
       <w:r>
+        <w:rPr>
+          <w:color w:val="FFFFFF"/>
+        </w:rPr>
         <w:t>20. Conclusão</w:t>
       </w:r>
     </w:p>
@@ -10469,8 +10892,14 @@
     <w:p>
       <w:pPr>
         <w:pStyle w:val="Heading1"/>
+        <w:shd w:fill="3333B2"/>
+        <w:spacing w:before="260" w:after="160" w:line="259" w:lineRule="auto"/>
+        <w:ind w:left="102" w:right="0"/>
       </w:pPr>
       <w:r>
+        <w:rPr>
+          <w:color w:val="FFFFFF"/>
+        </w:rPr>
         <w:t>21. Referências</w:t>
       </w:r>
     </w:p>
@@ -10481,7 +10910,7 @@
       <w:hyperlink r:id="rId20">
         <w:r>
           <w:rPr>
-            <w:color w:val="2F75B5"/>
+            <w:color w:val="4D4DC4"/>
             <w:u w:val="single"/>
           </w:rPr>
           <w:t>Protocolo e instrumentação dos trials</w:t>
@@ -10495,7 +10924,7 @@
       <w:hyperlink r:id="rId21">
         <w:r>
           <w:rPr>
-            <w:color w:val="2F75B5"/>
+            <w:color w:val="4D4DC4"/>
             <w:u w:val="single"/>
           </w:rPr>
           <w:t>Definições e execução das análises</w:t>
@@ -10509,7 +10938,7 @@
       <w:hyperlink r:id="rId22">
         <w:r>
           <w:rPr>
-            <w:color w:val="2F75B5"/>
+            <w:color w:val="4D4DC4"/>
             <w:u w:val="single"/>
           </w:rPr>
           <w:t>Coletor e definições das métricas estruturais</w:t>
@@ -10523,7 +10952,7 @@
       <w:hyperlink r:id="rId23">
         <w:r>
           <w:rPr>
-            <w:color w:val="2F75B5"/>
+            <w:color w:val="4D4DC4"/>
             <w:u w:val="single"/>
           </w:rPr>
           <w:t>Relatório consolidado da Sprint 03</w:t>
@@ -10537,7 +10966,7 @@
       <w:hyperlink r:id="rId24">
         <w:r>
           <w:rPr>
-            <w:color w:val="2F75B5"/>
+            <w:color w:val="4D4DC4"/>
             <w:u w:val="single"/>
           </w:rPr>
           <w:t>Registro individual de Fernanda</w:t>
@@ -10551,7 +10980,7 @@
       <w:hyperlink r:id="rId25">
         <w:r>
           <w:rPr>
-            <w:color w:val="2F75B5"/>
+            <w:color w:val="4D4DC4"/>
             <w:u w:val="single"/>
           </w:rPr>
           <w:t>Registro individual de Islayder</w:t>
@@ -10565,7 +10994,7 @@
       <w:hyperlink r:id="rId26">
         <w:r>
           <w:rPr>
-            <w:color w:val="2F75B5"/>
+            <w:color w:val="4D4DC4"/>
             <w:u w:val="single"/>
           </w:rPr>
           <w:t>Registro individual de Vinicius</w:t>
@@ -10991,7 +11420,7 @@
       <w:jc w:val="both"/>
     </w:pPr>
     <w:rPr>
-      <w:rFonts w:ascii="Times New Roman" w:hAnsi="Times New Roman" w:eastAsia="Times New Roman"/>
+      <w:rFonts w:ascii="Arial" w:hAnsi="Arial" w:eastAsia="Arial"/>
       <w:color w:val="202124"/>
       <w:sz w:val="21"/>
     </w:rPr>
@@ -11068,8 +11497,8 @@
       <w:rFonts w:asciiTheme="majorHAnsi" w:eastAsiaTheme="majorEastAsia" w:hAnsiTheme="majorHAnsi" w:cstheme="majorBidi" w:ascii="Arial" w:hAnsi="Arial" w:eastAsia="Arial"/>
       <w:b/>
       <w:bCs/>
-      <w:color w:val="17365D"/>
-      <w:sz w:val="30"/>
+      <w:color w:val="FFFFFF"/>
+      <w:sz w:val="28"/>
       <w:szCs w:val="28"/>
     </w:rPr>
   </w:style>
@@ -11092,7 +11521,7 @@
       <w:rFonts w:asciiTheme="majorHAnsi" w:eastAsiaTheme="majorEastAsia" w:hAnsiTheme="majorHAnsi" w:cstheme="majorBidi" w:ascii="Arial" w:hAnsi="Arial" w:eastAsia="Arial"/>
       <w:b/>
       <w:bCs/>
-      <w:color w:val="2F75B5"/>
+      <w:color w:val="3333B2"/>
       <w:sz w:val="24"/>
       <w:szCs w:val="26"/>
     </w:rPr>
@@ -11357,7 +11786,7 @@
     <w:rPr>
       <w:rFonts w:asciiTheme="majorHAnsi" w:eastAsiaTheme="majorEastAsia" w:hAnsiTheme="majorHAnsi" w:cstheme="majorBidi" w:ascii="Arial" w:hAnsi="Arial" w:eastAsia="Arial"/>
       <w:b/>
-      <w:color w:val="17365D"/>
+      <w:color w:val="3333B2"/>
       <w:spacing w:val="5"/>
       <w:kern w:val="28"/>
       <w:sz w:val="44"/>
@@ -22698,7 +23127,7 @@
       <w:jc w:val="center"/>
     </w:pPr>
     <w:rPr>
-      <w:rFonts w:ascii="Times New Roman" w:hAnsi="Times New Roman"/>
+      <w:rFonts w:ascii="Arial" w:hAnsi="Arial"/>
       <w:i/>
       <w:color w:val="5B6573"/>
       <w:sz w:val="18"/>
@@ -22711,9 +23140,9 @@
       <w:spacing w:before="140" w:after="60"/>
     </w:pPr>
     <w:rPr>
-      <w:rFonts w:ascii="Times New Roman" w:hAnsi="Times New Roman"/>
+      <w:rFonts w:ascii="Arial" w:hAnsi="Arial"/>
       <w:b/>
-      <w:color w:val="17365D"/>
+      <w:color w:val="3333B2"/>
       <w:sz w:val="18"/>
     </w:rPr>
   </w:style>

</xml_diff>